<commit_message>
docs: agregar modelo de base de datos con evidencias fotograficas y actualizar diario de reflexion de Alexander
</commit_message>
<xml_diff>
--- a/docs/Fase 2 Casptone/Evidencias Individuales/Alexander Sáez/2.1_APT122_DiarioReflexionFase2_Alexander.docx
+++ b/docs/Fase 2 Casptone/Evidencias Individuales/Alexander Sáez/2.1_APT122_DiarioReflexionFase2_Alexander.docx
@@ -1,12 +1,12 @@
 
 <file path=word/document.xml><?xml version="1.0" encoding="utf-8"?>
-<w:document xmlns:wpc="http://schemas.microsoft.com/office/word/2010/wordprocessingCanvas" xmlns:cx="http://schemas.microsoft.com/office/drawing/2014/chartex" xmlns:mc="http://schemas.openxmlformats.org/markup-compatibility/2006" xmlns:o="urn:schemas-microsoft-com:office:office" xmlns:r="http://schemas.openxmlformats.org/officeDocument/2006/relationships" xmlns:m="http://schemas.openxmlformats.org/officeDocument/2006/math" xmlns:v="urn:schemas-microsoft-com:vml" xmlns:wp14="http://schemas.microsoft.com/office/word/2010/wordprocessingDrawing" xmlns:wp="http://schemas.openxmlformats.org/drawingml/2006/wordprocessingDrawing" xmlns:w10="urn:schemas-microsoft-com:office:word" xmlns:w="http://schemas.openxmlformats.org/wordprocessingml/2006/main" xmlns:w14="http://schemas.microsoft.com/office/word/2010/wordml" xmlns:w15="http://schemas.microsoft.com/office/word/2012/wordml" xmlns:w16se="http://schemas.microsoft.com/office/word/2015/wordml/symex" xmlns:wpg="http://schemas.microsoft.com/office/word/2010/wordprocessingGroup" xmlns:wpi="http://schemas.microsoft.com/office/word/2010/wordprocessingInk" xmlns:wne="http://schemas.microsoft.com/office/word/2006/wordml" xmlns:wps="http://schemas.microsoft.com/office/word/2010/wordprocessingShape" mc:Ignorable="w14 w15 w16se wp14">
+<w:document xmlns:wpc="http://schemas.microsoft.com/office/word/2010/wordprocessingCanvas" xmlns:cx="http://schemas.microsoft.com/office/drawing/2014/chartex" xmlns:cx1="http://schemas.microsoft.com/office/drawing/2015/9/8/chartex" xmlns:cx2="http://schemas.microsoft.com/office/drawing/2015/10/21/chartex" xmlns:cx3="http://schemas.microsoft.com/office/drawing/2016/5/9/chartex" xmlns:cx4="http://schemas.microsoft.com/office/drawing/2016/5/10/chartex" xmlns:cx5="http://schemas.microsoft.com/office/drawing/2016/5/11/chartex" xmlns:cx6="http://schemas.microsoft.com/office/drawing/2016/5/12/chartex" xmlns:cx7="http://schemas.microsoft.com/office/drawing/2016/5/13/chartex" xmlns:cx8="http://schemas.microsoft.com/office/drawing/2016/5/14/chartex" xmlns:mc="http://schemas.openxmlformats.org/markup-compatibility/2006" xmlns:aink="http://schemas.microsoft.com/office/drawing/2016/ink" xmlns:am3d="http://schemas.microsoft.com/office/drawing/2017/model3d" xmlns:o="urn:schemas-microsoft-com:office:office" xmlns:oel="http://schemas.microsoft.com/office/2019/extlst" xmlns:r="http://schemas.openxmlformats.org/officeDocument/2006/relationships" xmlns:m="http://schemas.openxmlformats.org/officeDocument/2006/math" xmlns:v="urn:schemas-microsoft-com:vml" xmlns:wp14="http://schemas.microsoft.com/office/word/2010/wordprocessingDrawing" xmlns:wp="http://schemas.openxmlformats.org/drawingml/2006/wordprocessingDrawing" xmlns:w10="urn:schemas-microsoft-com:office:word" xmlns:w="http://schemas.openxmlformats.org/wordprocessingml/2006/main" xmlns:w14="http://schemas.microsoft.com/office/word/2010/wordml" xmlns:w15="http://schemas.microsoft.com/office/word/2012/wordml" xmlns:w16cex="http://schemas.microsoft.com/office/word/2018/wordml/cex" xmlns:w16cid="http://schemas.microsoft.com/office/word/2016/wordml/cid" xmlns:w16="http://schemas.microsoft.com/office/word/2018/wordml" xmlns:w16sdtdh="http://schemas.microsoft.com/office/word/2020/wordml/sdtdatahash" xmlns:w16se="http://schemas.microsoft.com/office/word/2015/wordml/symex" xmlns:wpg="http://schemas.microsoft.com/office/word/2010/wordprocessingGroup" xmlns:wpi="http://schemas.microsoft.com/office/word/2010/wordprocessingInk" xmlns:wne="http://schemas.microsoft.com/office/word/2006/wordml" xmlns:wps="http://schemas.microsoft.com/office/word/2010/wordprocessingShape" mc:Ignorable="w14 w15 w16se w16cid w16 w16cex w16sdtdh wp14">
   <w:body>
     <w:p/>
     <w:tbl>
       <w:tblPr>
         <w:tblStyle w:val="Tablaconcuadrcula"/>
-        <w:tblW w:w="9923" w:type="dxa"/>
+        <w:tblW w:w="19011" w:type="dxa"/>
         <w:tblBorders>
           <w:top w:val="none" w:sz="0" w:space="0" w:color="auto"/>
           <w:left w:val="none" w:sz="0" w:space="0" w:color="auto"/>
@@ -19,6 +19,7 @@
       </w:tblPr>
       <w:tblGrid>
         <w:gridCol w:w="835"/>
+        <w:gridCol w:w="9088"/>
         <w:gridCol w:w="9088"/>
       </w:tblGrid>
       <w:tr>
@@ -51,7 +52,7 @@
                 <w:lang w:eastAsia="es-CL"/>
               </w:rPr>
               <w:drawing>
-                <wp:inline distT="0" distB="0" distL="0" distR="0" wp14:anchorId="5010E2A1" wp14:editId="32D31CB8">
+                <wp:inline distT="0" distB="0" distL="0" distR="0" wp14:anchorId="5B3635DE" wp14:editId="49BD6C4D">
                   <wp:extent cx="393640" cy="444500"/>
                   <wp:effectExtent l="0" t="0" r="0" b="0"/>
                   <wp:docPr id="17578" name="Imagen 3"/>
@@ -107,23 +108,43 @@
           </w:tcPr>
           <w:p>
             <w:r>
-              <w:t>PAUTA DE MONITOREO Y REFLEXIÓN INDIVIDUAL / GRUPAL - FASE 2</w:t>
+              <w:rPr>
+                <w:rFonts w:eastAsiaTheme="majorEastAsia"/>
+                <w:sz w:val="24"/>
+                <w:szCs w:val="24"/>
+              </w:rPr>
+              <w:t xml:space="preserve">Esta pauta tiene como objetivo ayudarte a monitorear el desarrollo de tu Proyecto APT, reflexionando sobre tus avances de acuerdo con lo planificado en la fase anterior y recibiendo retroalimentación de tus </w:t>
+            </w:r>
+            <w:proofErr w:type="spellStart"/>
+            <w:r>
+              <w:rPr>
+                <w:rFonts w:eastAsiaTheme="majorEastAsia"/>
+                <w:sz w:val="24"/>
+                <w:szCs w:val="24"/>
+              </w:rPr>
+              <w:t>pares</w:t>
+            </w:r>
+            <w:proofErr w:type="spellEnd"/>
+            <w:r>
+              <w:rPr>
+                <w:rFonts w:eastAsiaTheme="majorEastAsia"/>
+                <w:sz w:val="24"/>
+                <w:szCs w:val="24"/>
+              </w:rPr>
+              <w:t xml:space="preserve"> y docentes que te permita hacer los ajustes necesarios para cumplir con los objetivos de tu proyecto. Esta pauta debe ser respondida con tu grupo. </w:t>
+            </w:r>
+          </w:p>
+        </w:tc>
+        <w:tc>
+          <w:tcPr>
+            <w:tcW w:w="9088" w:type="dxa"/>
+          </w:tcPr>
+          <w:p>
+            <w:r>
               <w:br/>
-              <w:t>PROYECTO CAPSTONE (PTY4614) - DUOC UC</w:t>
+            </w:r>
+            <w:r>
               <w:br/>
-              <w:br/>
-              <w:t>DATOS DEL ESTUDIANTE:</w:t>
-              <w:br/>
-              <w:t>• Nombre completo: Alexander Andrés Sáez López</w:t>
-              <w:br/>
-              <w:t>• Rol en ATLAS: Modelado y Gestión de Base de Datos (PostgreSQL / Neon), Persistencia e Infraestructura</w:t>
-              <w:br/>
-              <w:t>• Asignatura: Capstone (PTY4614) | Semestre: Primavera 2026 | Fecha: Octubre 2026</w:t>
-              <w:br/>
-              <w:t>• Proyecto: ATLAS – Plataforma de Registro Operativo y Trazabilidad para Soporte en Terreno</w:t>
-              <w:br/>
-              <w:br/>
-              <w:t>Esta pauta tiene como objetivo monitorear el desarrollo del Proyecto APT, reflexionando sobre los avances según lo planificado, evaluando el desempeño individual y grupal, y recibiendo retroalimentación que permita realizar los ajustes necesarios para el cumplimiento de los objetivos.</w:t>
             </w:r>
           </w:p>
         </w:tc>
@@ -272,7 +293,25 @@
                 <w:sz w:val="24"/>
                 <w:szCs w:val="24"/>
               </w:rPr>
-              <w:t>1. Mira tu carta Gantt y reflexiona sobre los avances de tu Proyecto APT</w:t>
+              <w:t xml:space="preserve">1. Mira </w:t>
+            </w:r>
+            <w:proofErr w:type="spellStart"/>
+            <w:r>
+              <w:rPr>
+                <w:rFonts w:eastAsiaTheme="majorEastAsia"/>
+                <w:sz w:val="24"/>
+                <w:szCs w:val="24"/>
+              </w:rPr>
+              <w:t>tu</w:t>
+            </w:r>
+            <w:proofErr w:type="spellEnd"/>
+            <w:r>
+              <w:rPr>
+                <w:rFonts w:eastAsiaTheme="majorEastAsia"/>
+                <w:sz w:val="24"/>
+                <w:szCs w:val="24"/>
+              </w:rPr>
+              <w:t xml:space="preserve"> carta Gantt y reflexiona sobre los avances de tu Proyecto APT</w:t>
             </w:r>
           </w:p>
         </w:tc>
@@ -285,31 +324,164 @@
           <w:tcPr>
             <w:tcW w:w="10076" w:type="dxa"/>
             <w:shd w:val="clear" w:color="auto" w:fill="DEEAF6" w:themeFill="accent1" w:themeFillTint="33"/>
-            <w:vAlign w:val="top"/>
           </w:tcPr>
           <w:p>
             <w:r>
               <w:t>¿Has podido cumplir todas las actividades en los tiempos definidos? ¿Qué factores han facilitado o dificultado el desarrollo de las actividades de tu plan de trabajo?</w:t>
+            </w:r>
+            <w:r>
               <w:br/>
               <w:t>Respuesta:</w:t>
+            </w:r>
+            <w:r>
               <w:br/>
-              <w:t>No de manera lineal respecto al cronograma inicial de la Carta Gantt. Desde mi rol a cargo del modelado de datos, la persistencia en PostgreSQL (Neon) y la infraestructura del backend, el desarrollo avanzó en ciclos iterativos de ajuste continuo. Logré completar con éxito el despliegue de Neon Serverless, la definición del Diagrama Entidad-Relación (DER) normalizado y la implementación de las tablas centrales (órdenes de trabajo, técnicos, clientes, routers, SIM cards y checklist técnico).</w:t>
+              <w:t>No de manera lineal respecto al cronograma inicial de la Carta Gantt. Desde mi rol a cargo del modelado de datos, la persistencia en PostgreSQL (</w:t>
+            </w:r>
+            <w:proofErr w:type="spellStart"/>
+            <w:r>
+              <w:t>Neon</w:t>
+            </w:r>
+            <w:proofErr w:type="spellEnd"/>
+            <w:r>
+              <w:t xml:space="preserve">) y la infraestructura del </w:t>
+            </w:r>
+            <w:proofErr w:type="spellStart"/>
+            <w:r>
+              <w:t>backend</w:t>
+            </w:r>
+            <w:proofErr w:type="spellEnd"/>
+            <w:r>
+              <w:t xml:space="preserve">, el desarrollo avanzó en ciclos iterativos de ajuste continuo. Logré completar con éxito el despliegue de </w:t>
+            </w:r>
+            <w:proofErr w:type="spellStart"/>
+            <w:r>
+              <w:t>Neon</w:t>
+            </w:r>
+            <w:proofErr w:type="spellEnd"/>
+            <w:r>
+              <w:t xml:space="preserve"> </w:t>
+            </w:r>
+            <w:proofErr w:type="spellStart"/>
+            <w:r>
+              <w:t>Serverless</w:t>
+            </w:r>
+            <w:proofErr w:type="spellEnd"/>
+            <w:r>
+              <w:t xml:space="preserve">, la definición del Diagrama Entidad-Relación (DER) normalizado y la implementación de las tablas centrales (órdenes de trabajo, técnicos, clientes, </w:t>
+            </w:r>
+            <w:proofErr w:type="spellStart"/>
+            <w:r>
+              <w:t>routers</w:t>
+            </w:r>
+            <w:proofErr w:type="spellEnd"/>
+            <w:r>
+              <w:t xml:space="preserve">, SIM </w:t>
+            </w:r>
+            <w:proofErr w:type="spellStart"/>
+            <w:r>
+              <w:t>cards</w:t>
+            </w:r>
+            <w:proofErr w:type="spellEnd"/>
+            <w:r>
+              <w:t xml:space="preserve"> y </w:t>
+            </w:r>
+            <w:proofErr w:type="spellStart"/>
+            <w:r>
+              <w:t>checklist</w:t>
+            </w:r>
+            <w:proofErr w:type="spellEnd"/>
+            <w:r>
+              <w:t xml:space="preserve"> técnico).</w:t>
+            </w:r>
+            <w:r>
               <w:br/>
+            </w:r>
+            <w:r>
               <w:br/>
               <w:t>Factores facilitadores:</w:t>
+            </w:r>
+            <w:r>
               <w:br/>
               <w:t>1. Una definición clara de las entidades de negocio desde las fases tempranas, lo que permitió estructurar tablas con integridad referencial sólida y claves foráneas consistentes.</w:t>
+            </w:r>
+            <w:r>
               <w:br/>
-              <w:t>2. La flexibilidad y rapidez de aprovisionamiento de Neon Serverless para gestionar variables de entorno, pools de conexión y scripts de seed con datos reales.</w:t>
+              <w:t xml:space="preserve">2. La flexibilidad y rapidez de aprovisionamiento de </w:t>
+            </w:r>
+            <w:proofErr w:type="spellStart"/>
+            <w:r>
+              <w:t>Neon</w:t>
+            </w:r>
+            <w:proofErr w:type="spellEnd"/>
+            <w:r>
+              <w:t xml:space="preserve"> </w:t>
+            </w:r>
+            <w:proofErr w:type="spellStart"/>
+            <w:r>
+              <w:t>Serverless</w:t>
+            </w:r>
+            <w:proofErr w:type="spellEnd"/>
+            <w:r>
+              <w:t xml:space="preserve"> para gestionar variables de entorno, pools de conexión y scripts de </w:t>
+            </w:r>
+            <w:proofErr w:type="spellStart"/>
+            <w:r>
+              <w:t>seed</w:t>
+            </w:r>
+            <w:proofErr w:type="spellEnd"/>
+            <w:r>
+              <w:t xml:space="preserve"> con datos reales.</w:t>
+            </w:r>
+            <w:r>
               <w:br/>
-              <w:t>3. El uso coordinado de Notion y GitHub para registrar tareas y cambios de esquema.</w:t>
+              <w:t xml:space="preserve">3. El uso coordinado de </w:t>
+            </w:r>
+            <w:proofErr w:type="spellStart"/>
+            <w:r>
+              <w:t>Notion</w:t>
+            </w:r>
+            <w:proofErr w:type="spellEnd"/>
+            <w:r>
+              <w:t xml:space="preserve"> y GitHub para registrar tareas y cambios de esquema.</w:t>
+            </w:r>
+            <w:r>
               <w:br/>
+            </w:r>
+            <w:r>
               <w:br/>
               <w:t>Factores obstaculizadores:</w:t>
+            </w:r>
+            <w:r>
               <w:br/>
-              <w:t>1. Desajustes en los tiempos por dependencias técnicas: modificaciones en las vistas de la aplicación técnica (PWA) y el portal de clientes requirieron refactorizaciones sobre esquemas y queries de persistencia.</w:t>
+              <w:t xml:space="preserve">1. Desajustes en los tiempos por dependencias técnicas: modificaciones en las vistas de la aplicación técnica (PWA) y el portal de clientes requirieron refactorizaciones sobre esquemas y </w:t>
+            </w:r>
+            <w:proofErr w:type="spellStart"/>
+            <w:r>
+              <w:t>queries</w:t>
+            </w:r>
+            <w:proofErr w:type="spellEnd"/>
+            <w:r>
+              <w:t xml:space="preserve"> de persistencia.</w:t>
+            </w:r>
+            <w:r>
               <w:br/>
-              <w:t>2. La necesidad de eliminar datos simulados (mocks) que se utilizaban provisionalmente en frontend para reemplazarlos por consultas reales a la API y base de datos, lo que exigió mayor tiempo de depuración e integración conjunta.</w:t>
+              <w:t>2. La necesidad de eliminar datos simulados (</w:t>
+            </w:r>
+            <w:proofErr w:type="spellStart"/>
+            <w:r>
+              <w:t>mocks</w:t>
+            </w:r>
+            <w:proofErr w:type="spellEnd"/>
+            <w:r>
+              <w:t xml:space="preserve">) que se utilizaban provisionalmente en </w:t>
+            </w:r>
+            <w:proofErr w:type="spellStart"/>
+            <w:r>
+              <w:t>frontend</w:t>
+            </w:r>
+            <w:proofErr w:type="spellEnd"/>
+            <w:r>
+              <w:t xml:space="preserve"> para reemplazarlos por consultas reales a la API y base de datos, lo que exigió mayor tiempo de depuración e integración conjunta.</w:t>
             </w:r>
           </w:p>
         </w:tc>
@@ -383,22 +555,132 @@
           <w:tcPr>
             <w:tcW w:w="10076" w:type="dxa"/>
             <w:shd w:val="clear" w:color="auto" w:fill="DEEAF6" w:themeFill="accent1" w:themeFillTint="33"/>
-            <w:vAlign w:val="top"/>
           </w:tcPr>
           <w:p>
             <w:r>
+              <w:lastRenderedPageBreak/>
               <w:t>¿De qué manera has enfrentado y/o planeas enfrentar las dificultades que han afectado el desarrollo de tu Proyecto APT?</w:t>
+            </w:r>
+            <w:r>
               <w:br/>
               <w:t>Respuesta:</w:t>
+            </w:r>
+            <w:r>
               <w:br/>
               <w:t>Para superar las dificultades de desacoplamiento entre las pantallas y el almacenamiento persistente, adopté las siguientes medidas:</w:t>
+            </w:r>
+            <w:r>
               <w:br/>
+            </w:r>
+            <w:r>
               <w:br/>
-              <w:t>1. Trabajo coordinado en la capa de datos y API: Establecí una comunicación directa y constante con Joaquín (Backend/APIs) para asegurar que los modelos ORM de SQLAlchemy y los esquemas Pydantic coincidieran exactamente con la estructura de las tablas en PostgreSQL/Neon, evitando fallos de serialización o campos nulos no controlados.</w:t>
+              <w:t>1. Trabajo coordinado en la capa de datos y API: Establecí una comunicación directa y constante con Joaquín (</w:t>
+            </w:r>
+            <w:proofErr w:type="spellStart"/>
+            <w:r>
+              <w:t>Backend</w:t>
+            </w:r>
+            <w:proofErr w:type="spellEnd"/>
+            <w:r>
+              <w:t>/</w:t>
+            </w:r>
+            <w:proofErr w:type="spellStart"/>
+            <w:r>
+              <w:t>APIs</w:t>
+            </w:r>
+            <w:proofErr w:type="spellEnd"/>
+            <w:r>
+              <w:t xml:space="preserve">) para asegurar que los modelos ORM de </w:t>
+            </w:r>
+            <w:proofErr w:type="spellStart"/>
+            <w:r>
+              <w:t>SQLAlchemy</w:t>
+            </w:r>
+            <w:proofErr w:type="spellEnd"/>
+            <w:r>
+              <w:t xml:space="preserve"> y los esquemas </w:t>
+            </w:r>
+            <w:proofErr w:type="spellStart"/>
+            <w:r>
+              <w:t>Pydantic</w:t>
+            </w:r>
+            <w:proofErr w:type="spellEnd"/>
+            <w:r>
+              <w:t xml:space="preserve"> coincidieran exactamente con la estructura de las tablas en PostgreSQL/</w:t>
+            </w:r>
+            <w:proofErr w:type="spellStart"/>
+            <w:r>
+              <w:t>Neon</w:t>
+            </w:r>
+            <w:proofErr w:type="spellEnd"/>
+            <w:r>
+              <w:t>, evitando fallos de serialización o campos nulos no controlados.</w:t>
+            </w:r>
+            <w:r>
               <w:br/>
-              <w:t>2. Migración definitiva a datos reales: Diseñé y ejecuté scripts de carga inicial ('seed') con datos de prueba realistas (técnicos reales, clientes comerciales, inventario de routers y SIMs con series válidas), eliminando la dependencia de mocks aislados y permitiendo que tanto el Panel Web como la PWA operen contra la base de datos real.</w:t>
+              <w:t>2. Migración definitiva a datos reales: Diseñé y ejecuté scripts de carga inicial ('</w:t>
+            </w:r>
+            <w:proofErr w:type="spellStart"/>
+            <w:r>
+              <w:t>seed</w:t>
+            </w:r>
+            <w:proofErr w:type="spellEnd"/>
+            <w:r>
+              <w:t xml:space="preserve">') con datos de prueba realistas (técnicos reales, clientes comerciales, inventario de </w:t>
+            </w:r>
+            <w:proofErr w:type="spellStart"/>
+            <w:r>
+              <w:t>routers</w:t>
+            </w:r>
+            <w:proofErr w:type="spellEnd"/>
+            <w:r>
+              <w:t xml:space="preserve"> y </w:t>
+            </w:r>
+            <w:proofErr w:type="spellStart"/>
+            <w:r>
+              <w:t>SIMs</w:t>
+            </w:r>
+            <w:proofErr w:type="spellEnd"/>
+            <w:r>
+              <w:t xml:space="preserve"> con series válidas), eliminando la dependencia de </w:t>
+            </w:r>
+            <w:proofErr w:type="spellStart"/>
+            <w:r>
+              <w:t>mocks</w:t>
+            </w:r>
+            <w:proofErr w:type="spellEnd"/>
+            <w:r>
+              <w:t xml:space="preserve"> aislados y permitiendo que tanto el Panel Web como la PWA operen contra la base de datos real.</w:t>
+            </w:r>
+            <w:r>
               <w:br/>
-              <w:t>3. Ambientes de desarrollo seguros en Neon: Aproveché las capacidades de ramas (branches) de Neon para probar modificaciones estructurales sin poner en riesgo la base de datos de producción o del MVP demostrable.</w:t>
+              <w:t xml:space="preserve">3. Ambientes de desarrollo seguros en </w:t>
+            </w:r>
+            <w:proofErr w:type="spellStart"/>
+            <w:r>
+              <w:t>Neon</w:t>
+            </w:r>
+            <w:proofErr w:type="spellEnd"/>
+            <w:r>
+              <w:t>: Aproveché las capacidades de ramas (</w:t>
+            </w:r>
+            <w:proofErr w:type="spellStart"/>
+            <w:r>
+              <w:t>branches</w:t>
+            </w:r>
+            <w:proofErr w:type="spellEnd"/>
+            <w:r>
+              <w:t xml:space="preserve">) de </w:t>
+            </w:r>
+            <w:proofErr w:type="spellStart"/>
+            <w:r>
+              <w:t>Neon</w:t>
+            </w:r>
+            <w:proofErr w:type="spellEnd"/>
+            <w:r>
+              <w:t xml:space="preserve"> para probar modificaciones estructurales sin poner en riesgo la base de datos de producción o del MVP demostrable.</w:t>
+            </w:r>
+            <w:r>
               <w:br/>
               <w:t>4. Plan de acción para los próximos hitos: Implementar validaciones automatizadas de integridad referencial, registrar métricas de tiempo de respuesta en consultas de alto tráfico (como la lista de órdenes activas) y formalizar la documentación técnica de las migraciones para todo el equipo.</w:t>
             </w:r>
@@ -570,31 +852,137 @@
           <w:tcPr>
             <w:tcW w:w="10076" w:type="dxa"/>
             <w:shd w:val="clear" w:color="auto" w:fill="DEEAF6" w:themeFill="accent1" w:themeFillTint="33"/>
-            <w:vAlign w:val="top"/>
           </w:tcPr>
           <w:p>
             <w:r>
               <w:t>¿Cómo evalúas tu trabajo? ¿Qué destacas y qué podrías hacer para mejorar tu trabajo?</w:t>
+            </w:r>
+            <w:r>
               <w:br/>
               <w:t>Respuesta:</w:t>
+            </w:r>
+            <w:r>
               <w:br/>
-              <w:t>Evalúo mi desempeño individual de manera muy satisfactoria y con un alto nivel de compromiso técnico. ATLAS cuenta actualmente con una arquitectura de persistencia robusta, normalizada y 100% operativa en la nube con PostgreSQL en Neon.</w:t>
+              <w:t xml:space="preserve">Evalúo mi desempeño individual de manera muy satisfactoria y con un alto nivel de compromiso técnico. ATLAS cuenta actualmente con una arquitectura de persistencia robusta, normalizada y 100% operativa en la nube con PostgreSQL en </w:t>
+            </w:r>
+            <w:proofErr w:type="spellStart"/>
+            <w:r>
+              <w:t>Neon</w:t>
+            </w:r>
+            <w:proofErr w:type="spellEnd"/>
+            <w:r>
+              <w:t>.</w:t>
+            </w:r>
+            <w:r>
               <w:br/>
+            </w:r>
+            <w:r>
               <w:br/>
               <w:t>Aspectos que destaco de mi trabajo:</w:t>
+            </w:r>
+            <w:r>
               <w:br/>
-              <w:t>• La solidez del modelo de datos: Lograr que entidades complejas (asignación de técnicos, cambio dinámico de estados de órdenes, registro de evidencias fotográficas, números de serie de routers y SIMs) convivan de forma estructurada, garantizando la trazabilidad histórica de cada atención técnica en terreno.</w:t>
+              <w:t xml:space="preserve">• La solidez del modelo de datos: Lograr que entidades complejas (asignación de técnicos, cambio dinámico de estados de órdenes, registro de evidencias fotográficas, números de serie de </w:t>
+            </w:r>
+            <w:proofErr w:type="spellStart"/>
+            <w:r>
+              <w:t>routers</w:t>
+            </w:r>
+            <w:proofErr w:type="spellEnd"/>
+            <w:r>
+              <w:t xml:space="preserve"> y </w:t>
+            </w:r>
+            <w:proofErr w:type="spellStart"/>
+            <w:r>
+              <w:t>SIMs</w:t>
+            </w:r>
+            <w:proofErr w:type="spellEnd"/>
+            <w:r>
+              <w:t>) convivan de forma estructurada, garantizando la trazabilidad histórica de cada atención técnica en terreno.</w:t>
+            </w:r>
+            <w:r>
               <w:br/>
-              <w:t>• Conectividad y estabilidad: La configuración confiable de la conexión asíncrona entre FastAPI y Neon, manejando pools de conexiones y protegiendo credenciales sensibles mediante variables de entorno seguras.</w:t>
+              <w:t xml:space="preserve">• Conectividad y estabilidad: La configuración confiable de la conexión asíncrona entre </w:t>
+            </w:r>
+            <w:proofErr w:type="spellStart"/>
+            <w:r>
+              <w:t>FastAPI</w:t>
+            </w:r>
+            <w:proofErr w:type="spellEnd"/>
+            <w:r>
+              <w:t xml:space="preserve"> y </w:t>
+            </w:r>
+            <w:proofErr w:type="spellStart"/>
+            <w:r>
+              <w:t>Neon</w:t>
+            </w:r>
+            <w:proofErr w:type="spellEnd"/>
+            <w:r>
+              <w:t>, manejando pools de conexiones y protegiendo credenciales sensibles mediante variables de entorno seguras.</w:t>
+            </w:r>
+            <w:r>
               <w:br/>
-              <w:t>• Apoyo transversal al equipo: Facilitar al equipo de desarrollo (frontend y PWA) datos estructurados y endpoints documentados para validar sus flujos de usuario.</w:t>
+            </w:r>
+            <w:r>
+              <w:lastRenderedPageBreak/>
+              <w:t>• Apoyo transversal al equipo: Facilitar al equipo de desarrollo (</w:t>
+            </w:r>
+            <w:proofErr w:type="spellStart"/>
+            <w:r>
+              <w:t>frontend</w:t>
+            </w:r>
+            <w:proofErr w:type="spellEnd"/>
+            <w:r>
+              <w:t xml:space="preserve"> y PWA) datos estructurados y </w:t>
+            </w:r>
+            <w:proofErr w:type="spellStart"/>
+            <w:r>
+              <w:t>endpoints</w:t>
+            </w:r>
+            <w:proofErr w:type="spellEnd"/>
+            <w:r>
+              <w:t xml:space="preserve"> documentados para validar sus flujos de usuario.</w:t>
+            </w:r>
+            <w:r>
               <w:br/>
+            </w:r>
+            <w:r>
               <w:br/>
               <w:t>Oportunidades de mejora para mi trabajo:</w:t>
+            </w:r>
+            <w:r>
               <w:br/>
               <w:t>• Mayor involucramiento en pruebas de interfaz de usuario (UI): Participar más tempranamente en la validación visual de los formularios para anticipar qué campos requerirán validaciones de negocio adicionales antes de llegar a la base de datos.</w:t>
+            </w:r>
+            <w:r>
               <w:br/>
-              <w:t>• Documentación de contingencia: Elaborar un manual detallado de procedimientos de respaldo (backup), snapshots y políticas de recuperación de datos ante caídas imprevistas del servicio cloud.</w:t>
+              <w:t>• Documentación de contingencia: Elaborar un manual detallado de procedimientos de respaldo (</w:t>
+            </w:r>
+            <w:proofErr w:type="spellStart"/>
+            <w:r>
+              <w:t>backup</w:t>
+            </w:r>
+            <w:proofErr w:type="spellEnd"/>
+            <w:r>
+              <w:t xml:space="preserve">), </w:t>
+            </w:r>
+            <w:proofErr w:type="spellStart"/>
+            <w:r>
+              <w:t>snapshots</w:t>
+            </w:r>
+            <w:proofErr w:type="spellEnd"/>
+            <w:r>
+              <w:t xml:space="preserve"> y políticas de recuperación de datos ante caídas imprevistas del servicio </w:t>
+            </w:r>
+            <w:proofErr w:type="spellStart"/>
+            <w:r>
+              <w:t>cloud</w:t>
+            </w:r>
+            <w:proofErr w:type="spellEnd"/>
+            <w:r>
+              <w:t>.</w:t>
+            </w:r>
+            <w:r>
               <w:br/>
               <w:t>• Calidad editorial: Atender rigurosamente la retroalimentación de la docente respecto a la ortografía, tildes y nombres de campos en los scripts y documentación técnica generada.</w:t>
             </w:r>
@@ -671,26 +1059,89 @@
           <w:tcPr>
             <w:tcW w:w="10076" w:type="dxa"/>
             <w:shd w:val="clear" w:color="auto" w:fill="DEEAF6" w:themeFill="accent1" w:themeFillTint="33"/>
-            <w:vAlign w:val="top"/>
           </w:tcPr>
           <w:p>
             <w:r>
               <w:t>¿Qué inquietudes te quedan sobre cómo proceder? ¿Qué pregunta te gustaría hacerle a tu docente o a tus pares?</w:t>
+            </w:r>
+            <w:r>
               <w:br/>
               <w:t>Respuesta:</w:t>
+            </w:r>
+            <w:r>
               <w:br/>
               <w:t>Preguntas e inquietudes para la docente:</w:t>
+            </w:r>
+            <w:r>
               <w:br/>
-              <w:t>1. En relación con la entrega final de Capstone, ¿qué nivel de formalidad y detalle se espera respecto a los planes de contingencia, seguridad de datos (hashing de credenciales, cifrado en reposo) y protocolos de respaldo en la nube?</w:t>
+              <w:t xml:space="preserve">1. En relación con la entrega final de </w:t>
+            </w:r>
+            <w:proofErr w:type="spellStart"/>
+            <w:r>
+              <w:t>Capstone</w:t>
+            </w:r>
+            <w:proofErr w:type="spellEnd"/>
+            <w:r>
+              <w:t>, ¿qué nivel de formalidad y detalle se espera respecto a los planes de contingencia, seguridad de datos (</w:t>
+            </w:r>
+            <w:proofErr w:type="spellStart"/>
+            <w:r>
+              <w:t>hashing</w:t>
+            </w:r>
+            <w:proofErr w:type="spellEnd"/>
+            <w:r>
+              <w:t xml:space="preserve"> de credenciales, cifrado en reposo) y protocolos de respaldo en la nube?</w:t>
+            </w:r>
+            <w:r>
               <w:br/>
-              <w:t>2. Para la defensa técnica y demostración en vivo, ¿es conveniente contar con un script de demostración guiado que inserte y modifique órdenes en tiempo real para evidenciar la reactividad de la base de datos en Neon?</w:t>
+              <w:t xml:space="preserve">2. Para la defensa técnica y demostración en vivo, ¿es conveniente contar con un script de demostración guiado que inserte y modifique órdenes en tiempo real para evidenciar la reactividad de la base de datos en </w:t>
+            </w:r>
+            <w:proofErr w:type="spellStart"/>
+            <w:r>
+              <w:t>Neon</w:t>
+            </w:r>
+            <w:proofErr w:type="spellEnd"/>
+            <w:r>
+              <w:t>?</w:t>
+            </w:r>
+            <w:r>
               <w:br/>
+            </w:r>
+            <w:r>
               <w:br/>
               <w:t>Inquietudes planteadas a mis pares (Diego, Joaquín y Matías):</w:t>
+            </w:r>
+            <w:r>
               <w:br/>
-              <w:t>1. ¿Cómo coordinaremos la paginación y filtros de búsqueda en el Panel Web y la PWA técnica para asegurar que las consultas SQL sigan respondiendo en menos de 200 ms cuando el volumen de órdenes supere las cientos de transacciones?</w:t>
+              <w:t xml:space="preserve">1. ¿Cómo coordinaremos la paginación y filtros de búsqueda en el Panel Web y la PWA técnica para asegurar que las consultas SQL sigan respondiendo en menos de 200 ms cuando el volumen de órdenes supere </w:t>
+            </w:r>
+            <w:proofErr w:type="gramStart"/>
+            <w:r>
+              <w:t>las cientos</w:t>
+            </w:r>
+            <w:proofErr w:type="gramEnd"/>
+            <w:r>
+              <w:t xml:space="preserve"> de transacciones?</w:t>
+            </w:r>
+            <w:r>
               <w:br/>
-              <w:t>2. ¿Están todos los flujos de la aplicación técnica (PWA) enviando los identificadores de hardware (SIM/Router) en el formato estandarizado que exige la base de datos, para evitar rechazos por constraints de validación durante las pruebas integrales?</w:t>
+              <w:t>2. ¿Están todos los flujos de la aplicación técnica (PWA) enviando los identificadores de hardware (SIM/</w:t>
+            </w:r>
+            <w:proofErr w:type="spellStart"/>
+            <w:r>
+              <w:t>Router</w:t>
+            </w:r>
+            <w:proofErr w:type="spellEnd"/>
+            <w:r>
+              <w:t xml:space="preserve">) en el formato estandarizado que exige la base de datos, para evitar rechazos por </w:t>
+            </w:r>
+            <w:proofErr w:type="spellStart"/>
+            <w:r>
+              <w:t>constraints</w:t>
+            </w:r>
+            <w:proofErr w:type="spellEnd"/>
+            <w:r>
+              <w:t xml:space="preserve"> de validación durante las pruebas integrales?</w:t>
             </w:r>
           </w:p>
         </w:tc>
@@ -776,30 +1227,175 @@
           <w:tcPr>
             <w:tcW w:w="10076" w:type="dxa"/>
             <w:shd w:val="clear" w:color="auto" w:fill="DEEAF6" w:themeFill="accent1" w:themeFillTint="33"/>
-            <w:vAlign w:val="top"/>
           </w:tcPr>
           <w:p>
             <w:r>
               <w:t>¿Consideran que las actividades deben ser redistribuidas entre los miembros del grupo? ¿Hay nuevas actividades que deban ser asignadas a algún miembro del grupo?</w:t>
+            </w:r>
+            <w:r>
               <w:br/>
               <w:t>Respuesta:</w:t>
+            </w:r>
+            <w:r>
               <w:br/>
               <w:t>Considero que la distribución por áreas de especialización debe mantenerse firme, ya que ha permitido avanzar con profundidad técnica en cada componente del sistema:</w:t>
+            </w:r>
+            <w:r>
               <w:br/>
-              <w:t>• Alexander Sáez: Modelado de datos, persistencia en Neon PostgreSQL, infraestructura cloud y soporte en backend.</w:t>
+              <w:t xml:space="preserve">• Alexander Sáez: Modelado de datos, persistencia en </w:t>
+            </w:r>
+            <w:proofErr w:type="spellStart"/>
+            <w:r>
+              <w:t>Neon</w:t>
+            </w:r>
+            <w:proofErr w:type="spellEnd"/>
+            <w:r>
+              <w:t xml:space="preserve"> PostgreSQL, infraestructura </w:t>
+            </w:r>
+            <w:proofErr w:type="spellStart"/>
+            <w:r>
+              <w:t>cloud</w:t>
+            </w:r>
+            <w:proofErr w:type="spellEnd"/>
+            <w:r>
+              <w:t xml:space="preserve"> y soporte en </w:t>
+            </w:r>
+            <w:proofErr w:type="spellStart"/>
+            <w:r>
+              <w:t>backend</w:t>
+            </w:r>
+            <w:proofErr w:type="spellEnd"/>
+            <w:r>
+              <w:t>.</w:t>
+            </w:r>
+            <w:r>
               <w:br/>
-              <w:t>• Joaquín Mendoza: Desarrollo backend, endpoints FastAPI, lógica de servicios y rol de Product Owner.</w:t>
+              <w:t xml:space="preserve">• Joaquín Mendoza: Desarrollo </w:t>
+            </w:r>
+            <w:proofErr w:type="spellStart"/>
+            <w:r>
+              <w:t>backend</w:t>
+            </w:r>
+            <w:proofErr w:type="spellEnd"/>
+            <w:r>
+              <w:t xml:space="preserve">, </w:t>
+            </w:r>
+            <w:proofErr w:type="spellStart"/>
+            <w:r>
+              <w:t>endpoints</w:t>
+            </w:r>
+            <w:proofErr w:type="spellEnd"/>
+            <w:r>
+              <w:t xml:space="preserve"> </w:t>
+            </w:r>
+            <w:proofErr w:type="spellStart"/>
+            <w:r>
+              <w:t>FastAPI</w:t>
+            </w:r>
+            <w:proofErr w:type="spellEnd"/>
+            <w:r>
+              <w:t xml:space="preserve">, lógica de servicios y rol de </w:t>
+            </w:r>
+            <w:proofErr w:type="spellStart"/>
+            <w:r>
+              <w:t>Product</w:t>
+            </w:r>
+            <w:proofErr w:type="spellEnd"/>
+            <w:r>
+              <w:t xml:space="preserve"> </w:t>
+            </w:r>
+            <w:proofErr w:type="spellStart"/>
+            <w:r>
+              <w:t>Owner</w:t>
+            </w:r>
+            <w:proofErr w:type="spellEnd"/>
+            <w:r>
+              <w:t>.</w:t>
+            </w:r>
+            <w:r>
               <w:br/>
-              <w:t>• Diego Jiménez: Desarrollo de interfaces Web (React), maquetación, arquitectura frontend y presentación ejecutiva.</w:t>
+              <w:t>• Diego Jiménez: Desarrollo de interfaces Web (</w:t>
+            </w:r>
+            <w:proofErr w:type="spellStart"/>
+            <w:r>
+              <w:t>React</w:t>
+            </w:r>
+            <w:proofErr w:type="spellEnd"/>
+            <w:r>
+              <w:t xml:space="preserve">), maquetación, arquitectura </w:t>
+            </w:r>
+            <w:proofErr w:type="spellStart"/>
+            <w:r>
+              <w:t>frontend</w:t>
+            </w:r>
+            <w:proofErr w:type="spellEnd"/>
+            <w:r>
+              <w:t xml:space="preserve"> y presentación </w:t>
+            </w:r>
+            <w:r>
+              <w:lastRenderedPageBreak/>
+              <w:t>ejecutiva.</w:t>
+            </w:r>
+            <w:r>
               <w:br/>
               <w:t>• Matías Abarca: Desarrollo de la App Técnica PWA, pruebas de campo y aseguramiento de calidad (QA).</w:t>
+            </w:r>
+            <w:r>
               <w:br/>
+            </w:r>
+            <w:r>
               <w:br/>
               <w:t>Sin embargo, en esta fase de integración se hace indispensable asignar nuevas tareas cruzadas y colaborativas:</w:t>
+            </w:r>
+            <w:r>
               <w:br/>
-              <w:t>1. Pruebas de integración E2E (End-to-End): Asignar sesiones conjuntas entre Backend (Joaquín/Alexander) y Frontend/PWA (Diego/Matías) para simular el ciclo de vida completo de una orden técnica (desde la creación en el panel web hasta el cierre y checklist con fotos en la PWA), verificando que cada paso se registre de forma fehaciente en Neon.</w:t>
+              <w:t>1. Pruebas de integración E2E (</w:t>
+            </w:r>
+            <w:proofErr w:type="spellStart"/>
+            <w:r>
+              <w:t>End-to-End</w:t>
+            </w:r>
+            <w:proofErr w:type="spellEnd"/>
+            <w:r>
+              <w:t xml:space="preserve">): Asignar sesiones conjuntas entre </w:t>
+            </w:r>
+            <w:proofErr w:type="spellStart"/>
+            <w:r>
+              <w:t>Backend</w:t>
+            </w:r>
+            <w:proofErr w:type="spellEnd"/>
+            <w:r>
+              <w:t xml:space="preserve"> (Joaquín/Alexander) y </w:t>
+            </w:r>
+            <w:proofErr w:type="spellStart"/>
+            <w:r>
+              <w:t>Frontend</w:t>
+            </w:r>
+            <w:proofErr w:type="spellEnd"/>
+            <w:r>
+              <w:t xml:space="preserve">/PWA (Diego/Matías) para simular el ciclo de vida completo de una orden técnica (desde la creación en el panel web hasta el cierre y </w:t>
+            </w:r>
+            <w:proofErr w:type="spellStart"/>
+            <w:r>
+              <w:t>checklist</w:t>
+            </w:r>
+            <w:proofErr w:type="spellEnd"/>
+            <w:r>
+              <w:t xml:space="preserve"> con fotos en la PWA), verificando que cada paso se registre de forma fehaciente en </w:t>
+            </w:r>
+            <w:proofErr w:type="spellStart"/>
+            <w:r>
+              <w:t>Neon</w:t>
+            </w:r>
+            <w:proofErr w:type="spellEnd"/>
+            <w:r>
+              <w:t>.</w:t>
+            </w:r>
+            <w:r>
               <w:br/>
               <w:t>2. Auditoría de coherencia de datos: Revisión a cargo mío para auditar que ninguna vista presente datos estáticos o ficticios.</w:t>
+            </w:r>
+            <w:r>
               <w:br/>
               <w:t>3. Control de calidad de textos: Asignar a cada integrante la revisión ortográfica y acentual estricta de sus respectivos módulos según las observaciones docentes.</w:t>
             </w:r>
@@ -882,10 +1478,18 @@
                 <w:sz w:val="24"/>
                 <w:szCs w:val="24"/>
               </w:rPr>
-              <w:t>. APT  grupal</w:t>
-            </w:r>
-            <w:bookmarkStart w:id="0" w:name="_GoBack"/>
-            <w:bookmarkEnd w:id="0"/>
+              <w:t xml:space="preserve">. </w:t>
+            </w:r>
+            <w:proofErr w:type="gramStart"/>
+            <w:r>
+              <w:rPr>
+                <w:rFonts w:eastAsiaTheme="majorEastAsia"/>
+                <w:sz w:val="24"/>
+                <w:szCs w:val="24"/>
+              </w:rPr>
+              <w:t>APT  grupal</w:t>
+            </w:r>
+            <w:proofErr w:type="gramEnd"/>
           </w:p>
         </w:tc>
       </w:tr>
@@ -897,35 +1501,116 @@
           <w:tcPr>
             <w:tcW w:w="10076" w:type="dxa"/>
             <w:shd w:val="clear" w:color="auto" w:fill="DEEAF6" w:themeFill="accent1" w:themeFillTint="33"/>
-            <w:vAlign w:val="top"/>
           </w:tcPr>
           <w:p>
             <w:r>
               <w:t>¿Cómo evalúan el trabajo en grupo? ¿Qué aspectos positivos destacan? ¿Qué aspectos podrían mejorar?</w:t>
+            </w:r>
+            <w:r>
               <w:br/>
               <w:t>Respuesta:</w:t>
+            </w:r>
+            <w:r>
               <w:br/>
               <w:t>Evaluación general del trabajo en equipo:</w:t>
+            </w:r>
+            <w:r>
               <w:br/>
               <w:t>El trabajo grupal ha sido muy enriquecedor y productivo. Logramos materializar una idea de proyecto ambiciosa en un sistema informático real, conectado y con valor operativo tangible para empresas de telecomunicaciones y soporte técnico.</w:t>
+            </w:r>
+            <w:r>
               <w:br/>
+            </w:r>
+            <w:r>
               <w:br/>
               <w:t>Aspectos positivos destacados:</w:t>
+            </w:r>
+            <w:r>
               <w:br/>
-              <w:t>• Complementariedad de habilidades: La sinergia entre backend/BD, frontend y aplicación móvil nos permitió desarrollar los tres frentes tecnológicos en paralelo sin pisarnos el trabajo.</w:t>
+              <w:t xml:space="preserve">• Complementariedad de habilidades: La sinergia entre </w:t>
+            </w:r>
+            <w:proofErr w:type="spellStart"/>
+            <w:r>
+              <w:t>backend</w:t>
+            </w:r>
+            <w:proofErr w:type="spellEnd"/>
+            <w:r>
+              <w:t xml:space="preserve">/BD, </w:t>
+            </w:r>
+            <w:proofErr w:type="spellStart"/>
+            <w:r>
+              <w:t>frontend</w:t>
+            </w:r>
+            <w:proofErr w:type="spellEnd"/>
+            <w:r>
+              <w:t xml:space="preserve"> y aplicación móvil nos permitió desarrollar los tres frentes tecnológicos en paralelo sin pisarnos el trabajo.</w:t>
+            </w:r>
+            <w:r>
               <w:br/>
-              <w:t>• Buena disposición técnica: Frente a bloqueos de conectividad, variables de entorno o integración de servicios cloud, el equipo siempre mostró apertura para debatir la mejor solución arquitectónica.</w:t>
+              <w:t xml:space="preserve">• Buena disposición técnica: Frente a bloqueos de conectividad, variables de entorno o integración de servicios </w:t>
+            </w:r>
+            <w:proofErr w:type="spellStart"/>
+            <w:r>
+              <w:t>cloud</w:t>
+            </w:r>
+            <w:proofErr w:type="spellEnd"/>
+            <w:r>
+              <w:t>, el equipo siempre mostró apertura para debatir la mejor solución arquitectónica.</w:t>
+            </w:r>
+            <w:r>
               <w:br/>
-              <w:t>• Avance tangible hacia un MVP de calidad: El proyecto cuenta con un backend funcional, persistencia real en la nube y aplicaciones interactivas operativas.</w:t>
+              <w:t xml:space="preserve">• Avance tangible hacia un MVP de calidad: El proyecto cuenta con un </w:t>
+            </w:r>
+            <w:proofErr w:type="spellStart"/>
+            <w:r>
+              <w:t>backend</w:t>
+            </w:r>
+            <w:proofErr w:type="spellEnd"/>
+            <w:r>
+              <w:t xml:space="preserve"> funcional, persistencia real en la nube y aplicaciones interactivas operativas.</w:t>
+            </w:r>
+            <w:r>
               <w:br/>
+            </w:r>
+            <w:r>
               <w:br/>
               <w:t>Aspectos a mejorar como equipo:</w:t>
+            </w:r>
+            <w:r>
               <w:br/>
               <w:t>• Sincronización en la entrega de tareas: Debemos evitar que las tareas de un integrante se acumulen al final del sprint, pues esto genera cuellos de botella para quienes deben integrar o realizar pruebas cruzadas.</w:t>
+            </w:r>
+            <w:r>
               <w:br/>
-              <w:t>• Comunicación y actualización del tablero: Mantener el tablero Kanban en Notion actualizado en tiempo real y no únicamente antes de las entregas formales, explicitando bloqueos a tiempo para resolverlos en equipo.</w:t>
+              <w:t xml:space="preserve">• Comunicación y actualización del tablero: Mantener el tablero Kanban en </w:t>
+            </w:r>
+            <w:proofErr w:type="spellStart"/>
+            <w:r>
+              <w:t>Notion</w:t>
+            </w:r>
+            <w:proofErr w:type="spellEnd"/>
+            <w:r>
+              <w:t xml:space="preserve"> actualizado en tiempo real y no únicamente antes de las entregas formales, explicitando bloqueos a tiempo para resolverlos en equipo.</w:t>
+            </w:r>
+            <w:r>
               <w:br/>
-              <w:t>• Acuerdos de cierre: Definir 'criterios de terminado' (Definition of Done) más estrictos antes de dar por finalizada una funcionalidad.</w:t>
+              <w:t>• Acuerdos de cierre: Definir 'criterios de terminado' (</w:t>
+            </w:r>
+            <w:proofErr w:type="spellStart"/>
+            <w:r>
+              <w:t>Definition</w:t>
+            </w:r>
+            <w:proofErr w:type="spellEnd"/>
+            <w:r>
+              <w:t xml:space="preserve"> </w:t>
+            </w:r>
+            <w:proofErr w:type="spellStart"/>
+            <w:r>
+              <w:t>of</w:t>
+            </w:r>
+            <w:proofErr w:type="spellEnd"/>
+            <w:r>
+              <w:t xml:space="preserve"> Done) más estrictos antes de dar por finalizada una funcionalidad.</w:t>
             </w:r>
           </w:p>
         </w:tc>
@@ -970,7 +1655,7 @@
 </file>
 
 <file path=word/endnotes.xml><?xml version="1.0" encoding="utf-8"?>
-<w:endnotes xmlns:wpc="http://schemas.microsoft.com/office/word/2010/wordprocessingCanvas" xmlns:cx="http://schemas.microsoft.com/office/drawing/2014/chartex" xmlns:mc="http://schemas.openxmlformats.org/markup-compatibility/2006" xmlns:o="urn:schemas-microsoft-com:office:office" xmlns:r="http://schemas.openxmlformats.org/officeDocument/2006/relationships" xmlns:m="http://schemas.openxmlformats.org/officeDocument/2006/math" xmlns:v="urn:schemas-microsoft-com:vml" xmlns:wp14="http://schemas.microsoft.com/office/word/2010/wordprocessingDrawing" xmlns:wp="http://schemas.openxmlformats.org/drawingml/2006/wordprocessingDrawing" xmlns:w10="urn:schemas-microsoft-com:office:word" xmlns:w="http://schemas.openxmlformats.org/wordprocessingml/2006/main" xmlns:w14="http://schemas.microsoft.com/office/word/2010/wordml" xmlns:w15="http://schemas.microsoft.com/office/word/2012/wordml" xmlns:w16se="http://schemas.microsoft.com/office/word/2015/wordml/symex" xmlns:wpg="http://schemas.microsoft.com/office/word/2010/wordprocessingGroup" xmlns:wpi="http://schemas.microsoft.com/office/word/2010/wordprocessingInk" xmlns:wne="http://schemas.microsoft.com/office/word/2006/wordml" xmlns:wps="http://schemas.microsoft.com/office/word/2010/wordprocessingShape" mc:Ignorable="w14 w15 w16se wp14">
+<w:endnotes xmlns:wpc="http://schemas.microsoft.com/office/word/2010/wordprocessingCanvas" xmlns:cx="http://schemas.microsoft.com/office/drawing/2014/chartex" xmlns:cx1="http://schemas.microsoft.com/office/drawing/2015/9/8/chartex" xmlns:cx2="http://schemas.microsoft.com/office/drawing/2015/10/21/chartex" xmlns:cx3="http://schemas.microsoft.com/office/drawing/2016/5/9/chartex" xmlns:cx4="http://schemas.microsoft.com/office/drawing/2016/5/10/chartex" xmlns:cx5="http://schemas.microsoft.com/office/drawing/2016/5/11/chartex" xmlns:cx6="http://schemas.microsoft.com/office/drawing/2016/5/12/chartex" xmlns:cx7="http://schemas.microsoft.com/office/drawing/2016/5/13/chartex" xmlns:cx8="http://schemas.microsoft.com/office/drawing/2016/5/14/chartex" xmlns:mc="http://schemas.openxmlformats.org/markup-compatibility/2006" xmlns:aink="http://schemas.microsoft.com/office/drawing/2016/ink" xmlns:am3d="http://schemas.microsoft.com/office/drawing/2017/model3d" xmlns:o="urn:schemas-microsoft-com:office:office" xmlns:oel="http://schemas.microsoft.com/office/2019/extlst" xmlns:r="http://schemas.openxmlformats.org/officeDocument/2006/relationships" xmlns:m="http://schemas.openxmlformats.org/officeDocument/2006/math" xmlns:v="urn:schemas-microsoft-com:vml" xmlns:wp14="http://schemas.microsoft.com/office/word/2010/wordprocessingDrawing" xmlns:wp="http://schemas.openxmlformats.org/drawingml/2006/wordprocessingDrawing" xmlns:w10="urn:schemas-microsoft-com:office:word" xmlns:w="http://schemas.openxmlformats.org/wordprocessingml/2006/main" xmlns:w14="http://schemas.microsoft.com/office/word/2010/wordml" xmlns:w15="http://schemas.microsoft.com/office/word/2012/wordml" xmlns:w16cex="http://schemas.microsoft.com/office/word/2018/wordml/cex" xmlns:w16cid="http://schemas.microsoft.com/office/word/2016/wordml/cid" xmlns:w16="http://schemas.microsoft.com/office/word/2018/wordml" xmlns:w16sdtdh="http://schemas.microsoft.com/office/word/2020/wordml/sdtdatahash" xmlns:w16se="http://schemas.microsoft.com/office/word/2015/wordml/symex" xmlns:wpg="http://schemas.microsoft.com/office/word/2010/wordprocessingGroup" xmlns:wpi="http://schemas.microsoft.com/office/word/2010/wordprocessingInk" xmlns:wne="http://schemas.microsoft.com/office/word/2006/wordml" xmlns:wps="http://schemas.microsoft.com/office/word/2010/wordprocessingShape" mc:Ignorable="w14 w15 w16se w16cid w16 w16cex w16sdtdh wp14">
   <w:endnote w:type="separator" w:id="-1">
     <w:p>
       <w:pPr>
@@ -995,7 +1680,7 @@
 </file>
 
 <file path=word/footer1.xml><?xml version="1.0" encoding="utf-8"?>
-<w:ftr xmlns:wpc="http://schemas.microsoft.com/office/word/2010/wordprocessingCanvas" xmlns:cx="http://schemas.microsoft.com/office/drawing/2014/chartex" xmlns:mc="http://schemas.openxmlformats.org/markup-compatibility/2006" xmlns:o="urn:schemas-microsoft-com:office:office" xmlns:r="http://schemas.openxmlformats.org/officeDocument/2006/relationships" xmlns:m="http://schemas.openxmlformats.org/officeDocument/2006/math" xmlns:v="urn:schemas-microsoft-com:vml" xmlns:wp14="http://schemas.microsoft.com/office/word/2010/wordprocessingDrawing" xmlns:wp="http://schemas.openxmlformats.org/drawingml/2006/wordprocessingDrawing" xmlns:w10="urn:schemas-microsoft-com:office:word" xmlns:w="http://schemas.openxmlformats.org/wordprocessingml/2006/main" xmlns:w14="http://schemas.microsoft.com/office/word/2010/wordml" xmlns:w15="http://schemas.microsoft.com/office/word/2012/wordml" xmlns:w16se="http://schemas.microsoft.com/office/word/2015/wordml/symex" xmlns:wpg="http://schemas.microsoft.com/office/word/2010/wordprocessingGroup" xmlns:wpi="http://schemas.microsoft.com/office/word/2010/wordprocessingInk" xmlns:wne="http://schemas.microsoft.com/office/word/2006/wordml" xmlns:wps="http://schemas.microsoft.com/office/word/2010/wordprocessingShape" mc:Ignorable="w14 w15 w16se wp14">
+<w:ftr xmlns:wpc="http://schemas.microsoft.com/office/word/2010/wordprocessingCanvas" xmlns:cx="http://schemas.microsoft.com/office/drawing/2014/chartex" xmlns:cx1="http://schemas.microsoft.com/office/drawing/2015/9/8/chartex" xmlns:cx2="http://schemas.microsoft.com/office/drawing/2015/10/21/chartex" xmlns:cx3="http://schemas.microsoft.com/office/drawing/2016/5/9/chartex" xmlns:cx4="http://schemas.microsoft.com/office/drawing/2016/5/10/chartex" xmlns:cx5="http://schemas.microsoft.com/office/drawing/2016/5/11/chartex" xmlns:cx6="http://schemas.microsoft.com/office/drawing/2016/5/12/chartex" xmlns:cx7="http://schemas.microsoft.com/office/drawing/2016/5/13/chartex" xmlns:cx8="http://schemas.microsoft.com/office/drawing/2016/5/14/chartex" xmlns:mc="http://schemas.openxmlformats.org/markup-compatibility/2006" xmlns:aink="http://schemas.microsoft.com/office/drawing/2016/ink" xmlns:am3d="http://schemas.microsoft.com/office/drawing/2017/model3d" xmlns:o="urn:schemas-microsoft-com:office:office" xmlns:oel="http://schemas.microsoft.com/office/2019/extlst" xmlns:r="http://schemas.openxmlformats.org/officeDocument/2006/relationships" xmlns:m="http://schemas.openxmlformats.org/officeDocument/2006/math" xmlns:v="urn:schemas-microsoft-com:vml" xmlns:wp14="http://schemas.microsoft.com/office/word/2010/wordprocessingDrawing" xmlns:wp="http://schemas.openxmlformats.org/drawingml/2006/wordprocessingDrawing" xmlns:w10="urn:schemas-microsoft-com:office:word" xmlns:w="http://schemas.openxmlformats.org/wordprocessingml/2006/main" xmlns:w14="http://schemas.microsoft.com/office/word/2010/wordml" xmlns:w15="http://schemas.microsoft.com/office/word/2012/wordml" xmlns:w16cex="http://schemas.microsoft.com/office/word/2018/wordml/cex" xmlns:w16cid="http://schemas.microsoft.com/office/word/2016/wordml/cid" xmlns:w16="http://schemas.microsoft.com/office/word/2018/wordml" xmlns:w16sdtdh="http://schemas.microsoft.com/office/word/2020/wordml/sdtdatahash" xmlns:w16se="http://schemas.microsoft.com/office/word/2015/wordml/symex" xmlns:wpg="http://schemas.microsoft.com/office/word/2010/wordprocessingGroup" xmlns:wpi="http://schemas.microsoft.com/office/word/2010/wordprocessingInk" xmlns:wne="http://schemas.microsoft.com/office/word/2006/wordml" xmlns:wps="http://schemas.microsoft.com/office/word/2010/wordprocessingShape" mc:Ignorable="w14 w15 w16se w16cid w16 w16cex w16sdtdh wp14">
   <w:sdt>
     <w:sdtPr>
       <w:id w:val="-937982979"/>
@@ -1004,7 +1689,6 @@
         <w:docPartUnique/>
       </w:docPartObj>
     </w:sdtPr>
-    <w:sdtEndPr/>
     <w:sdtContent>
       <w:p>
         <w:pPr>
@@ -1018,7 +1702,7 @@
           <mc:AlternateContent>
             <mc:Choice Requires="wpg">
               <w:drawing>
-                <wp:anchor distT="0" distB="0" distL="114300" distR="114300" simplePos="0" relativeHeight="251659264" behindDoc="0" locked="0" layoutInCell="1" allowOverlap="1" wp14:anchorId="51D00065" wp14:editId="474BEB81">
+                <wp:anchor distT="0" distB="0" distL="114300" distR="114300" simplePos="0" relativeHeight="251659264" behindDoc="0" locked="0" layoutInCell="1" allowOverlap="1" wp14:anchorId="31A7C274" wp14:editId="0BDBACFE">
                   <wp:simplePos x="0" y="0"/>
                   <wp:positionH relativeFrom="page">
                     <wp:align>center</wp:align>
@@ -1216,7 +1900,7 @@
             </mc:Choice>
             <mc:Fallback>
               <w:pict>
-                <v:group w14:anchorId="51D00065" id="Grupo 32" o:spid="_x0000_s1026" style="position:absolute;margin-left:0;margin-top:0;width:610.5pt;height:15pt;z-index:251659264;mso-width-percent:1000;mso-position-horizontal:center;mso-position-horizontal-relative:page;mso-position-vertical:center;mso-position-vertical-relative:bottom-margin-area;mso-width-percent:1000" coordorigin=",14970" coordsize="12255,300" o:gfxdata="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">
+                <v:group w14:anchorId="31A7C274" id="Grupo 32" o:spid="_x0000_s1026" style="position:absolute;margin-left:0;margin-top:0;width:610.5pt;height:15pt;z-index:251659264;mso-width-percent:1000;mso-position-horizontal:center;mso-position-horizontal-relative:page;mso-position-vertical:center;mso-position-vertical-relative:bottom-margin-area;mso-width-percent:1000" coordorigin=",14970" coordsize="12255,300" o:gfxdata="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">
                   <v:shapetype id="_x0000_t202" coordsize="21600,21600" o:spt="202" path="m,l,21600r21600,l21600,xe">
                     <v:stroke joinstyle="miter"/>
                     <v:path gradientshapeok="t" o:connecttype="rect"/>
@@ -1283,7 +1967,7 @@
 </file>
 
 <file path=word/footnotes.xml><?xml version="1.0" encoding="utf-8"?>
-<w:footnotes xmlns:wpc="http://schemas.microsoft.com/office/word/2010/wordprocessingCanvas" xmlns:cx="http://schemas.microsoft.com/office/drawing/2014/chartex" xmlns:mc="http://schemas.openxmlformats.org/markup-compatibility/2006" xmlns:o="urn:schemas-microsoft-com:office:office" xmlns:r="http://schemas.openxmlformats.org/officeDocument/2006/relationships" xmlns:m="http://schemas.openxmlformats.org/officeDocument/2006/math" xmlns:v="urn:schemas-microsoft-com:vml" xmlns:wp14="http://schemas.microsoft.com/office/word/2010/wordprocessingDrawing" xmlns:wp="http://schemas.openxmlformats.org/drawingml/2006/wordprocessingDrawing" xmlns:w10="urn:schemas-microsoft-com:office:word" xmlns:w="http://schemas.openxmlformats.org/wordprocessingml/2006/main" xmlns:w14="http://schemas.microsoft.com/office/word/2010/wordml" xmlns:w15="http://schemas.microsoft.com/office/word/2012/wordml" xmlns:w16se="http://schemas.microsoft.com/office/word/2015/wordml/symex" xmlns:wpg="http://schemas.microsoft.com/office/word/2010/wordprocessingGroup" xmlns:wpi="http://schemas.microsoft.com/office/word/2010/wordprocessingInk" xmlns:wne="http://schemas.microsoft.com/office/word/2006/wordml" xmlns:wps="http://schemas.microsoft.com/office/word/2010/wordprocessingShape" mc:Ignorable="w14 w15 w16se wp14">
+<w:footnotes xmlns:wpc="http://schemas.microsoft.com/office/word/2010/wordprocessingCanvas" xmlns:cx="http://schemas.microsoft.com/office/drawing/2014/chartex" xmlns:cx1="http://schemas.microsoft.com/office/drawing/2015/9/8/chartex" xmlns:cx2="http://schemas.microsoft.com/office/drawing/2015/10/21/chartex" xmlns:cx3="http://schemas.microsoft.com/office/drawing/2016/5/9/chartex" xmlns:cx4="http://schemas.microsoft.com/office/drawing/2016/5/10/chartex" xmlns:cx5="http://schemas.microsoft.com/office/drawing/2016/5/11/chartex" xmlns:cx6="http://schemas.microsoft.com/office/drawing/2016/5/12/chartex" xmlns:cx7="http://schemas.microsoft.com/office/drawing/2016/5/13/chartex" xmlns:cx8="http://schemas.microsoft.com/office/drawing/2016/5/14/chartex" xmlns:mc="http://schemas.openxmlformats.org/markup-compatibility/2006" xmlns:aink="http://schemas.microsoft.com/office/drawing/2016/ink" xmlns:am3d="http://schemas.microsoft.com/office/drawing/2017/model3d" xmlns:o="urn:schemas-microsoft-com:office:office" xmlns:oel="http://schemas.microsoft.com/office/2019/extlst" xmlns:r="http://schemas.openxmlformats.org/officeDocument/2006/relationships" xmlns:m="http://schemas.openxmlformats.org/officeDocument/2006/math" xmlns:v="urn:schemas-microsoft-com:vml" xmlns:wp14="http://schemas.microsoft.com/office/word/2010/wordprocessingDrawing" xmlns:wp="http://schemas.openxmlformats.org/drawingml/2006/wordprocessingDrawing" xmlns:w10="urn:schemas-microsoft-com:office:word" xmlns:w="http://schemas.openxmlformats.org/wordprocessingml/2006/main" xmlns:w14="http://schemas.microsoft.com/office/word/2010/wordml" xmlns:w15="http://schemas.microsoft.com/office/word/2012/wordml" xmlns:w16cex="http://schemas.microsoft.com/office/word/2018/wordml/cex" xmlns:w16cid="http://schemas.microsoft.com/office/word/2016/wordml/cid" xmlns:w16="http://schemas.microsoft.com/office/word/2018/wordml" xmlns:w16sdtdh="http://schemas.microsoft.com/office/word/2020/wordml/sdtdatahash" xmlns:w16se="http://schemas.microsoft.com/office/word/2015/wordml/symex" xmlns:wpg="http://schemas.microsoft.com/office/word/2010/wordprocessingGroup" xmlns:wpi="http://schemas.microsoft.com/office/word/2010/wordprocessingInk" xmlns:wne="http://schemas.microsoft.com/office/word/2006/wordml" xmlns:wps="http://schemas.microsoft.com/office/word/2010/wordprocessingShape" mc:Ignorable="w14 w15 w16se w16cid w16 w16cex w16sdtdh wp14">
   <w:footnote w:type="separator" w:id="-1">
     <w:p>
       <w:pPr>
@@ -1308,7 +1992,7 @@
 </file>
 
 <file path=word/header1.xml><?xml version="1.0" encoding="utf-8"?>
-<w:hdr xmlns:wpc="http://schemas.microsoft.com/office/word/2010/wordprocessingCanvas" xmlns:cx="http://schemas.microsoft.com/office/drawing/2014/chartex" xmlns:mc="http://schemas.openxmlformats.org/markup-compatibility/2006" xmlns:o="urn:schemas-microsoft-com:office:office" xmlns:r="http://schemas.openxmlformats.org/officeDocument/2006/relationships" xmlns:m="http://schemas.openxmlformats.org/officeDocument/2006/math" xmlns:v="urn:schemas-microsoft-com:vml" xmlns:wp14="http://schemas.microsoft.com/office/word/2010/wordprocessingDrawing" xmlns:wp="http://schemas.openxmlformats.org/drawingml/2006/wordprocessingDrawing" xmlns:w10="urn:schemas-microsoft-com:office:word" xmlns:w="http://schemas.openxmlformats.org/wordprocessingml/2006/main" xmlns:w14="http://schemas.microsoft.com/office/word/2010/wordml" xmlns:w15="http://schemas.microsoft.com/office/word/2012/wordml" xmlns:w16se="http://schemas.microsoft.com/office/word/2015/wordml/symex" xmlns:wpg="http://schemas.microsoft.com/office/word/2010/wordprocessingGroup" xmlns:wpi="http://schemas.microsoft.com/office/word/2010/wordprocessingInk" xmlns:wne="http://schemas.microsoft.com/office/word/2006/wordml" xmlns:wps="http://schemas.microsoft.com/office/word/2010/wordprocessingShape" mc:Ignorable="w14 w15 w16se wp14">
+<w:hdr xmlns:wpc="http://schemas.microsoft.com/office/word/2010/wordprocessingCanvas" xmlns:cx="http://schemas.microsoft.com/office/drawing/2014/chartex" xmlns:cx1="http://schemas.microsoft.com/office/drawing/2015/9/8/chartex" xmlns:cx2="http://schemas.microsoft.com/office/drawing/2015/10/21/chartex" xmlns:cx3="http://schemas.microsoft.com/office/drawing/2016/5/9/chartex" xmlns:cx4="http://schemas.microsoft.com/office/drawing/2016/5/10/chartex" xmlns:cx5="http://schemas.microsoft.com/office/drawing/2016/5/11/chartex" xmlns:cx6="http://schemas.microsoft.com/office/drawing/2016/5/12/chartex" xmlns:cx7="http://schemas.microsoft.com/office/drawing/2016/5/13/chartex" xmlns:cx8="http://schemas.microsoft.com/office/drawing/2016/5/14/chartex" xmlns:mc="http://schemas.openxmlformats.org/markup-compatibility/2006" xmlns:aink="http://schemas.microsoft.com/office/drawing/2016/ink" xmlns:am3d="http://schemas.microsoft.com/office/drawing/2017/model3d" xmlns:o="urn:schemas-microsoft-com:office:office" xmlns:oel="http://schemas.microsoft.com/office/2019/extlst" xmlns:r="http://schemas.openxmlformats.org/officeDocument/2006/relationships" xmlns:m="http://schemas.openxmlformats.org/officeDocument/2006/math" xmlns:v="urn:schemas-microsoft-com:vml" xmlns:wp14="http://schemas.microsoft.com/office/word/2010/wordprocessingDrawing" xmlns:wp="http://schemas.openxmlformats.org/drawingml/2006/wordprocessingDrawing" xmlns:w10="urn:schemas-microsoft-com:office:word" xmlns:w="http://schemas.openxmlformats.org/wordprocessingml/2006/main" xmlns:w14="http://schemas.microsoft.com/office/word/2010/wordml" xmlns:w15="http://schemas.microsoft.com/office/word/2012/wordml" xmlns:w16cex="http://schemas.microsoft.com/office/word/2018/wordml/cex" xmlns:w16cid="http://schemas.microsoft.com/office/word/2016/wordml/cid" xmlns:w16="http://schemas.microsoft.com/office/word/2018/wordml" xmlns:w16sdtdh="http://schemas.microsoft.com/office/word/2020/wordml/sdtdatahash" xmlns:w16se="http://schemas.microsoft.com/office/word/2015/wordml/symex" xmlns:wpg="http://schemas.microsoft.com/office/word/2010/wordprocessingGroup" xmlns:wpi="http://schemas.microsoft.com/office/word/2010/wordprocessingInk" xmlns:wne="http://schemas.microsoft.com/office/word/2006/wordml" xmlns:wps="http://schemas.microsoft.com/office/word/2010/wordprocessingShape" mc:Ignorable="w14 w15 w16se w16cid w16 w16cex w16sdtdh wp14">
   <w:tbl>
     <w:tblPr>
       <w:tblStyle w:val="Tablaconcuadrcula"/>
@@ -1423,7 +2107,7 @@
               <w:lang w:eastAsia="es-CL"/>
             </w:rPr>
             <w:drawing>
-              <wp:inline distT="0" distB="0" distL="0" distR="0" wp14:anchorId="4468F50A" wp14:editId="098D6783">
+              <wp:inline distT="0" distB="0" distL="0" distR="0" wp14:anchorId="3E15FF32" wp14:editId="6CEBEB1E">
                 <wp:extent cx="1996440" cy="428625"/>
                 <wp:effectExtent l="0" t="0" r="3810" b="9525"/>
                 <wp:docPr id="5" name="Imagen 5" descr="http://www.duoc.cl/normasgraficas/normasgraficas/marca-duoc/6logo-fondo-transparente/fondo-transparente.png"/>
@@ -1488,7 +2172,7 @@
 </file>
 
 <file path=word/header2.xml><?xml version="1.0" encoding="utf-8"?>
-<w:hdr xmlns:wpc="http://schemas.microsoft.com/office/word/2010/wordprocessingCanvas" xmlns:cx="http://schemas.microsoft.com/office/drawing/2014/chartex" xmlns:mc="http://schemas.openxmlformats.org/markup-compatibility/2006" xmlns:o="urn:schemas-microsoft-com:office:office" xmlns:r="http://schemas.openxmlformats.org/officeDocument/2006/relationships" xmlns:m="http://schemas.openxmlformats.org/officeDocument/2006/math" xmlns:v="urn:schemas-microsoft-com:vml" xmlns:wp14="http://schemas.microsoft.com/office/word/2010/wordprocessingDrawing" xmlns:wp="http://schemas.openxmlformats.org/drawingml/2006/wordprocessingDrawing" xmlns:w10="urn:schemas-microsoft-com:office:word" xmlns:w="http://schemas.openxmlformats.org/wordprocessingml/2006/main" xmlns:w14="http://schemas.microsoft.com/office/word/2010/wordml" xmlns:w15="http://schemas.microsoft.com/office/word/2012/wordml" xmlns:w16se="http://schemas.microsoft.com/office/word/2015/wordml/symex" xmlns:wpg="http://schemas.microsoft.com/office/word/2010/wordprocessingGroup" xmlns:wpi="http://schemas.microsoft.com/office/word/2010/wordprocessingInk" xmlns:wne="http://schemas.microsoft.com/office/word/2006/wordml" xmlns:wps="http://schemas.microsoft.com/office/word/2010/wordprocessingShape" mc:Ignorable="w14 w15 w16se wp14">
+<w:hdr xmlns:wpc="http://schemas.microsoft.com/office/word/2010/wordprocessingCanvas" xmlns:cx="http://schemas.microsoft.com/office/drawing/2014/chartex" xmlns:cx1="http://schemas.microsoft.com/office/drawing/2015/9/8/chartex" xmlns:cx2="http://schemas.microsoft.com/office/drawing/2015/10/21/chartex" xmlns:cx3="http://schemas.microsoft.com/office/drawing/2016/5/9/chartex" xmlns:cx4="http://schemas.microsoft.com/office/drawing/2016/5/10/chartex" xmlns:cx5="http://schemas.microsoft.com/office/drawing/2016/5/11/chartex" xmlns:cx6="http://schemas.microsoft.com/office/drawing/2016/5/12/chartex" xmlns:cx7="http://schemas.microsoft.com/office/drawing/2016/5/13/chartex" xmlns:cx8="http://schemas.microsoft.com/office/drawing/2016/5/14/chartex" xmlns:mc="http://schemas.openxmlformats.org/markup-compatibility/2006" xmlns:aink="http://schemas.microsoft.com/office/drawing/2016/ink" xmlns:am3d="http://schemas.microsoft.com/office/drawing/2017/model3d" xmlns:o="urn:schemas-microsoft-com:office:office" xmlns:oel="http://schemas.microsoft.com/office/2019/extlst" xmlns:r="http://schemas.openxmlformats.org/officeDocument/2006/relationships" xmlns:m="http://schemas.openxmlformats.org/officeDocument/2006/math" xmlns:v="urn:schemas-microsoft-com:vml" xmlns:wp14="http://schemas.microsoft.com/office/word/2010/wordprocessingDrawing" xmlns:wp="http://schemas.openxmlformats.org/drawingml/2006/wordprocessingDrawing" xmlns:w10="urn:schemas-microsoft-com:office:word" xmlns:w="http://schemas.openxmlformats.org/wordprocessingml/2006/main" xmlns:w14="http://schemas.microsoft.com/office/word/2010/wordml" xmlns:w15="http://schemas.microsoft.com/office/word/2012/wordml" xmlns:w16cex="http://schemas.microsoft.com/office/word/2018/wordml/cex" xmlns:w16cid="http://schemas.microsoft.com/office/word/2016/wordml/cid" xmlns:w16="http://schemas.microsoft.com/office/word/2018/wordml" xmlns:w16sdtdh="http://schemas.microsoft.com/office/word/2020/wordml/sdtdatahash" xmlns:w16se="http://schemas.microsoft.com/office/word/2015/wordml/symex" xmlns:wpg="http://schemas.microsoft.com/office/word/2010/wordprocessingGroup" xmlns:wpi="http://schemas.microsoft.com/office/word/2010/wordprocessingInk" xmlns:wne="http://schemas.microsoft.com/office/word/2006/wordml" xmlns:wps="http://schemas.microsoft.com/office/word/2010/wordprocessingShape" mc:Ignorable="w14 w15 w16se w16cid w16 w16cex w16sdtdh wp14">
   <w:tbl>
     <w:tblPr>
       <w:tblStyle w:val="Tablaconcuadrcula"/>
@@ -1535,7 +2219,7 @@
               <w:lang w:eastAsia="es-CL"/>
             </w:rPr>
             <w:drawing>
-              <wp:inline distT="0" distB="0" distL="0" distR="0" wp14:anchorId="0AF3685A" wp14:editId="619B4EF1">
+              <wp:inline distT="0" distB="0" distL="0" distR="0" wp14:anchorId="05883F61" wp14:editId="56F41B11">
                 <wp:extent cx="361950" cy="581025"/>
                 <wp:effectExtent l="0" t="0" r="0" b="9525"/>
                 <wp:docPr id="4" name="Imagen 4"/>
@@ -1701,7 +2385,7 @@
               <w:lang w:eastAsia="es-CL"/>
             </w:rPr>
             <w:drawing>
-              <wp:inline distT="0" distB="0" distL="0" distR="0" wp14:anchorId="36F6F579" wp14:editId="4A26501C">
+              <wp:inline distT="0" distB="0" distL="0" distR="0" wp14:anchorId="6DBF492B" wp14:editId="5E66E956">
                 <wp:extent cx="1895475" cy="466725"/>
                 <wp:effectExtent l="0" t="0" r="9525" b="9525"/>
                 <wp:docPr id="3" name="Imagen 3"/>
@@ -1763,7 +2447,7 @@
 </file>
 
 <file path=word/numbering.xml><?xml version="1.0" encoding="utf-8"?>
-<w:numbering xmlns:wpc="http://schemas.microsoft.com/office/word/2010/wordprocessingCanvas" xmlns:cx="http://schemas.microsoft.com/office/drawing/2014/chartex" xmlns:mc="http://schemas.openxmlformats.org/markup-compatibility/2006" xmlns:o="urn:schemas-microsoft-com:office:office" xmlns:r="http://schemas.openxmlformats.org/officeDocument/2006/relationships" xmlns:m="http://schemas.openxmlformats.org/officeDocument/2006/math" xmlns:v="urn:schemas-microsoft-com:vml" xmlns:wp14="http://schemas.microsoft.com/office/word/2010/wordprocessingDrawing" xmlns:wp="http://schemas.openxmlformats.org/drawingml/2006/wordprocessingDrawing" xmlns:w10="urn:schemas-microsoft-com:office:word" xmlns:w="http://schemas.openxmlformats.org/wordprocessingml/2006/main" xmlns:w14="http://schemas.microsoft.com/office/word/2010/wordml" xmlns:w15="http://schemas.microsoft.com/office/word/2012/wordml" xmlns:w16se="http://schemas.microsoft.com/office/word/2015/wordml/symex" xmlns:wpg="http://schemas.microsoft.com/office/word/2010/wordprocessingGroup" xmlns:wpi="http://schemas.microsoft.com/office/word/2010/wordprocessingInk" xmlns:wne="http://schemas.microsoft.com/office/word/2006/wordml" xmlns:wps="http://schemas.microsoft.com/office/word/2010/wordprocessingShape" mc:Ignorable="w14 w15 w16se wp14">
+<w:numbering xmlns:wpc="http://schemas.microsoft.com/office/word/2010/wordprocessingCanvas" xmlns:cx="http://schemas.microsoft.com/office/drawing/2014/chartex" xmlns:cx1="http://schemas.microsoft.com/office/drawing/2015/9/8/chartex" xmlns:cx2="http://schemas.microsoft.com/office/drawing/2015/10/21/chartex" xmlns:cx3="http://schemas.microsoft.com/office/drawing/2016/5/9/chartex" xmlns:cx4="http://schemas.microsoft.com/office/drawing/2016/5/10/chartex" xmlns:cx5="http://schemas.microsoft.com/office/drawing/2016/5/11/chartex" xmlns:cx6="http://schemas.microsoft.com/office/drawing/2016/5/12/chartex" xmlns:cx7="http://schemas.microsoft.com/office/drawing/2016/5/13/chartex" xmlns:cx8="http://schemas.microsoft.com/office/drawing/2016/5/14/chartex" xmlns:mc="http://schemas.openxmlformats.org/markup-compatibility/2006" xmlns:aink="http://schemas.microsoft.com/office/drawing/2016/ink" xmlns:am3d="http://schemas.microsoft.com/office/drawing/2017/model3d" xmlns:o="urn:schemas-microsoft-com:office:office" xmlns:oel="http://schemas.microsoft.com/office/2019/extlst" xmlns:r="http://schemas.openxmlformats.org/officeDocument/2006/relationships" xmlns:m="http://schemas.openxmlformats.org/officeDocument/2006/math" xmlns:v="urn:schemas-microsoft-com:vml" xmlns:wp14="http://schemas.microsoft.com/office/word/2010/wordprocessingDrawing" xmlns:wp="http://schemas.openxmlformats.org/drawingml/2006/wordprocessingDrawing" xmlns:w10="urn:schemas-microsoft-com:office:word" xmlns:w="http://schemas.openxmlformats.org/wordprocessingml/2006/main" xmlns:w14="http://schemas.microsoft.com/office/word/2010/wordml" xmlns:w15="http://schemas.microsoft.com/office/word/2012/wordml" xmlns:w16cex="http://schemas.microsoft.com/office/word/2018/wordml/cex" xmlns:w16cid="http://schemas.microsoft.com/office/word/2016/wordml/cid" xmlns:w16="http://schemas.microsoft.com/office/word/2018/wordml" xmlns:w16sdtdh="http://schemas.microsoft.com/office/word/2020/wordml/sdtdatahash" xmlns:w16se="http://schemas.microsoft.com/office/word/2015/wordml/symex" xmlns:wpg="http://schemas.microsoft.com/office/word/2010/wordprocessingGroup" xmlns:wpi="http://schemas.microsoft.com/office/word/2010/wordprocessingInk" xmlns:wne="http://schemas.microsoft.com/office/word/2006/wordml" xmlns:wps="http://schemas.microsoft.com/office/word/2010/wordprocessingShape" mc:Ignorable="w14 w15 w16se w16cid w16 w16cex w16sdtdh wp14">
   <w:abstractNum w:abstractNumId="0" w15:restartNumberingAfterBreak="0">
     <w:nsid w:val="049156A1"/>
     <w:multiLevelType w:val="hybridMultilevel"/>
@@ -6337,124 +7021,124 @@
       </w:rPr>
     </w:lvl>
   </w:abstractNum>
-  <w:num w:numId="1">
+  <w:num w:numId="1" w16cid:durableId="2136754965">
     <w:abstractNumId w:val="3"/>
   </w:num>
-  <w:num w:numId="2">
+  <w:num w:numId="2" w16cid:durableId="1463772111">
     <w:abstractNumId w:val="8"/>
   </w:num>
-  <w:num w:numId="3">
+  <w:num w:numId="3" w16cid:durableId="1238245644">
     <w:abstractNumId w:val="12"/>
   </w:num>
-  <w:num w:numId="4">
+  <w:num w:numId="4" w16cid:durableId="1086148858">
     <w:abstractNumId w:val="28"/>
   </w:num>
-  <w:num w:numId="5">
+  <w:num w:numId="5" w16cid:durableId="149449542">
     <w:abstractNumId w:val="30"/>
   </w:num>
-  <w:num w:numId="6">
+  <w:num w:numId="6" w16cid:durableId="1250579574">
     <w:abstractNumId w:val="4"/>
   </w:num>
-  <w:num w:numId="7">
+  <w:num w:numId="7" w16cid:durableId="1365205498">
     <w:abstractNumId w:val="11"/>
   </w:num>
-  <w:num w:numId="8">
+  <w:num w:numId="8" w16cid:durableId="1269390168">
     <w:abstractNumId w:val="19"/>
   </w:num>
-  <w:num w:numId="9">
+  <w:num w:numId="9" w16cid:durableId="1510410056">
     <w:abstractNumId w:val="15"/>
   </w:num>
-  <w:num w:numId="10">
+  <w:num w:numId="10" w16cid:durableId="83848539">
     <w:abstractNumId w:val="9"/>
   </w:num>
-  <w:num w:numId="11">
+  <w:num w:numId="11" w16cid:durableId="598870804">
     <w:abstractNumId w:val="24"/>
   </w:num>
-  <w:num w:numId="12">
+  <w:num w:numId="12" w16cid:durableId="22638132">
     <w:abstractNumId w:val="35"/>
   </w:num>
-  <w:num w:numId="13">
+  <w:num w:numId="13" w16cid:durableId="2083987278">
     <w:abstractNumId w:val="29"/>
   </w:num>
-  <w:num w:numId="14">
+  <w:num w:numId="14" w16cid:durableId="1415273318">
     <w:abstractNumId w:val="1"/>
   </w:num>
-  <w:num w:numId="15">
+  <w:num w:numId="15" w16cid:durableId="686297015">
     <w:abstractNumId w:val="36"/>
   </w:num>
-  <w:num w:numId="16">
+  <w:num w:numId="16" w16cid:durableId="1927691858">
     <w:abstractNumId w:val="21"/>
   </w:num>
-  <w:num w:numId="17">
+  <w:num w:numId="17" w16cid:durableId="891428543">
     <w:abstractNumId w:val="17"/>
   </w:num>
-  <w:num w:numId="18">
+  <w:num w:numId="18" w16cid:durableId="1795099173">
     <w:abstractNumId w:val="31"/>
   </w:num>
-  <w:num w:numId="19">
+  <w:num w:numId="19" w16cid:durableId="185170206">
     <w:abstractNumId w:val="10"/>
   </w:num>
-  <w:num w:numId="20">
+  <w:num w:numId="20" w16cid:durableId="1075857214">
     <w:abstractNumId w:val="39"/>
   </w:num>
-  <w:num w:numId="21">
+  <w:num w:numId="21" w16cid:durableId="656688600">
     <w:abstractNumId w:val="34"/>
   </w:num>
-  <w:num w:numId="22">
+  <w:num w:numId="22" w16cid:durableId="1024595507">
     <w:abstractNumId w:val="13"/>
   </w:num>
-  <w:num w:numId="23">
+  <w:num w:numId="23" w16cid:durableId="2095276171">
     <w:abstractNumId w:val="14"/>
   </w:num>
-  <w:num w:numId="24">
+  <w:num w:numId="24" w16cid:durableId="1141654124">
     <w:abstractNumId w:val="5"/>
   </w:num>
-  <w:num w:numId="25">
+  <w:num w:numId="25" w16cid:durableId="1980571664">
     <w:abstractNumId w:val="16"/>
   </w:num>
-  <w:num w:numId="26">
+  <w:num w:numId="26" w16cid:durableId="821580262">
     <w:abstractNumId w:val="20"/>
   </w:num>
-  <w:num w:numId="27">
+  <w:num w:numId="27" w16cid:durableId="1982297779">
     <w:abstractNumId w:val="23"/>
   </w:num>
-  <w:num w:numId="28">
+  <w:num w:numId="28" w16cid:durableId="853110388">
     <w:abstractNumId w:val="0"/>
   </w:num>
-  <w:num w:numId="29">
+  <w:num w:numId="29" w16cid:durableId="215822329">
     <w:abstractNumId w:val="18"/>
   </w:num>
-  <w:num w:numId="30">
+  <w:num w:numId="30" w16cid:durableId="918556577">
     <w:abstractNumId w:val="22"/>
   </w:num>
-  <w:num w:numId="31">
+  <w:num w:numId="31" w16cid:durableId="885877501">
     <w:abstractNumId w:val="2"/>
   </w:num>
-  <w:num w:numId="32">
+  <w:num w:numId="32" w16cid:durableId="2081713488">
     <w:abstractNumId w:val="7"/>
   </w:num>
-  <w:num w:numId="33">
+  <w:num w:numId="33" w16cid:durableId="486365437">
     <w:abstractNumId w:val="32"/>
   </w:num>
-  <w:num w:numId="34">
+  <w:num w:numId="34" w16cid:durableId="1812601491">
     <w:abstractNumId w:val="38"/>
   </w:num>
-  <w:num w:numId="35">
+  <w:num w:numId="35" w16cid:durableId="504983358">
     <w:abstractNumId w:val="6"/>
   </w:num>
-  <w:num w:numId="36">
+  <w:num w:numId="36" w16cid:durableId="513955892">
     <w:abstractNumId w:val="25"/>
   </w:num>
-  <w:num w:numId="37">
+  <w:num w:numId="37" w16cid:durableId="1856843330">
     <w:abstractNumId w:val="37"/>
   </w:num>
-  <w:num w:numId="38">
+  <w:num w:numId="38" w16cid:durableId="232352161">
     <w:abstractNumId w:val="27"/>
   </w:num>
-  <w:num w:numId="39">
+  <w:num w:numId="39" w16cid:durableId="1404108904">
     <w:abstractNumId w:val="26"/>
   </w:num>
-  <w:num w:numId="40">
+  <w:num w:numId="40" w16cid:durableId="1876959897">
     <w:abstractNumId w:val="33"/>
   </w:num>
   <w:numIdMacAtCleanup w:val="18"/>
@@ -6462,7 +7146,7 @@
 </file>
 
 <file path=word/styles.xml><?xml version="1.0" encoding="utf-8"?>
-<w:styles xmlns:mc="http://schemas.openxmlformats.org/markup-compatibility/2006" xmlns:r="http://schemas.openxmlformats.org/officeDocument/2006/relationships" xmlns:w="http://schemas.openxmlformats.org/wordprocessingml/2006/main" xmlns:w14="http://schemas.microsoft.com/office/word/2010/wordml" xmlns:w15="http://schemas.microsoft.com/office/word/2012/wordml" xmlns:w16se="http://schemas.microsoft.com/office/word/2015/wordml/symex" mc:Ignorable="w14 w15 w16se">
+<w:styles xmlns:mc="http://schemas.openxmlformats.org/markup-compatibility/2006" xmlns:r="http://schemas.openxmlformats.org/officeDocument/2006/relationships" xmlns:w="http://schemas.openxmlformats.org/wordprocessingml/2006/main" xmlns:w14="http://schemas.microsoft.com/office/word/2010/wordml" xmlns:w15="http://schemas.microsoft.com/office/word/2012/wordml" xmlns:w16cex="http://schemas.microsoft.com/office/word/2018/wordml/cex" xmlns:w16cid="http://schemas.microsoft.com/office/word/2016/wordml/cid" xmlns:w16="http://schemas.microsoft.com/office/word/2018/wordml" xmlns:w16sdtdh="http://schemas.microsoft.com/office/word/2020/wordml/sdtdatahash" xmlns:w16se="http://schemas.microsoft.com/office/word/2015/wordml/symex" mc:Ignorable="w14 w15 w16se w16cid w16 w16cex w16sdtdh">
   <w:docDefaults>
     <w:rPrDefault>
       <w:rPr>
@@ -6478,7 +7162,7 @@
       </w:pPr>
     </w:pPrDefault>
   </w:docDefaults>
-  <w:latentStyles w:defLockedState="0" w:defUIPriority="99" w:defSemiHidden="0" w:defUnhideWhenUsed="0" w:defQFormat="0" w:count="371">
+  <w:latentStyles w:defLockedState="0" w:defUIPriority="99" w:defSemiHidden="0" w:defUnhideWhenUsed="0" w:defQFormat="0" w:count="376">
     <w:lsdException w:name="Normal" w:uiPriority="0" w:qFormat="1"/>
     <w:lsdException w:name="heading 1" w:uiPriority="9" w:qFormat="1"/>
     <w:lsdException w:name="heading 2" w:semiHidden="1" w:uiPriority="9" w:unhideWhenUsed="1" w:qFormat="1"/>
@@ -6850,6 +7534,11 @@
     <w:lsdException w:name="List Table 5 Dark Accent 6" w:uiPriority="50"/>
     <w:lsdException w:name="List Table 6 Colorful Accent 6" w:uiPriority="51"/>
     <w:lsdException w:name="List Table 7 Colorful Accent 6" w:uiPriority="52"/>
+    <w:lsdException w:name="Mention" w:semiHidden="1" w:unhideWhenUsed="1"/>
+    <w:lsdException w:name="Smart Hyperlink" w:semiHidden="1" w:unhideWhenUsed="1"/>
+    <w:lsdException w:name="Hashtag" w:semiHidden="1" w:unhideWhenUsed="1"/>
+    <w:lsdException w:name="Unresolved Mention" w:semiHidden="1" w:unhideWhenUsed="1"/>
+    <w:lsdException w:name="Smart Link" w:semiHidden="1" w:unhideWhenUsed="1"/>
   </w:latentStyles>
   <w:style w:type="paragraph" w:default="1" w:styleId="Normal">
     <w:name w:val="Normal"/>
@@ -7833,7 +8522,7 @@
       <w:szCs w:val="24"/>
     </w:rPr>
   </w:style>
-  <w:style w:type="table" w:styleId="Cuadrculadetablaclara">
+  <w:style w:type="table" w:styleId="Tablaconcuadrculaclara">
     <w:name w:val="Grid Table Light"/>
     <w:basedOn w:val="Tablanormal"/>
     <w:uiPriority w:val="40"/>
@@ -7855,7 +8544,7 @@
   <w:style w:type="table" w:customStyle="1" w:styleId="Cuadrculadetablaclara1">
     <w:name w:val="Cuadrícula de tabla clara1"/>
     <w:basedOn w:val="Tablanormal"/>
-    <w:next w:val="Cuadrculadetablaclara"/>
+    <w:next w:val="Tablaconcuadrculaclara"/>
     <w:uiPriority w:val="40"/>
     <w:rsid w:val="00943DF1"/>
     <w:pPr>
@@ -7908,532 +8597,6 @@
     </w:rPr>
   </w:style>
 </w:styles>
-</file>
-
-<file path=word/glossary/document.xml><?xml version="1.0" encoding="utf-8"?>
-<w:glossaryDocument xmlns:wpc="http://schemas.microsoft.com/office/word/2010/wordprocessingCanvas" xmlns:cx="http://schemas.microsoft.com/office/drawing/2014/chartex" xmlns:mc="http://schemas.openxmlformats.org/markup-compatibility/2006" xmlns:o="urn:schemas-microsoft-com:office:office" xmlns:r="http://schemas.openxmlformats.org/officeDocument/2006/relationships" xmlns:m="http://schemas.openxmlformats.org/officeDocument/2006/math" xmlns:v="urn:schemas-microsoft-com:vml" xmlns:wp14="http://schemas.microsoft.com/office/word/2010/wordprocessingDrawing" xmlns:wp="http://schemas.openxmlformats.org/drawingml/2006/wordprocessingDrawing" xmlns:w10="urn:schemas-microsoft-com:office:word" xmlns:w="http://schemas.openxmlformats.org/wordprocessingml/2006/main" xmlns:w14="http://schemas.microsoft.com/office/word/2010/wordml" xmlns:w15="http://schemas.microsoft.com/office/word/2012/wordml" xmlns:w16se="http://schemas.microsoft.com/office/word/2015/wordml/symex" xmlns:wpg="http://schemas.microsoft.com/office/word/2010/wordprocessingGroup" xmlns:wpi="http://schemas.microsoft.com/office/word/2010/wordprocessingInk" xmlns:wne="http://schemas.microsoft.com/office/word/2006/wordml" xmlns:wps="http://schemas.microsoft.com/office/word/2010/wordprocessingShape" mc:Ignorable="w14 w15 w16se wp14"/>
-</file>
-
-<file path=word/glossary/fontTable.xml><?xml version="1.0" encoding="utf-8"?>
-<w:fonts xmlns:mc="http://schemas.openxmlformats.org/markup-compatibility/2006" xmlns:r="http://schemas.openxmlformats.org/officeDocument/2006/relationships" xmlns:w="http://schemas.openxmlformats.org/wordprocessingml/2006/main" xmlns:w14="http://schemas.microsoft.com/office/word/2010/wordml" xmlns:w15="http://schemas.microsoft.com/office/word/2012/wordml" xmlns:w16se="http://schemas.microsoft.com/office/word/2015/wordml/symex" mc:Ignorable="w14 w15 w16se">
-  <w:font w:name="Calibri">
-    <w:panose1 w:val="020F0502020204030204"/>
-    <w:charset w:val="00"/>
-    <w:family w:val="swiss"/>
-    <w:pitch w:val="variable"/>
-    <w:sig w:usb0="E4002EFF" w:usb1="C000247B" w:usb2="00000009" w:usb3="00000000" w:csb0="000001FF" w:csb1="00000000"/>
-  </w:font>
-  <w:font w:name="Times New Roman">
-    <w:panose1 w:val="02020603050405020304"/>
-    <w:charset w:val="00"/>
-    <w:family w:val="roman"/>
-    <w:pitch w:val="variable"/>
-    <w:sig w:usb0="E0002EFF" w:usb1="C000785B" w:usb2="00000009" w:usb3="00000000" w:csb0="000001FF" w:csb1="00000000"/>
-  </w:font>
-  <w:font w:name="Courier New">
-    <w:panose1 w:val="02070309020205020404"/>
-    <w:charset w:val="00"/>
-    <w:family w:val="modern"/>
-    <w:pitch w:val="fixed"/>
-    <w:sig w:usb0="E0002EFF" w:usb1="C0007843" w:usb2="00000009" w:usb3="00000000" w:csb0="000001FF" w:csb1="00000000"/>
-  </w:font>
-  <w:font w:name="Wingdings">
-    <w:panose1 w:val="05000000000000000000"/>
-    <w:charset w:val="02"/>
-    <w:family w:val="auto"/>
-    <w:pitch w:val="variable"/>
-    <w:sig w:usb0="00000000" w:usb1="10000000" w:usb2="00000000" w:usb3="00000000" w:csb0="80000000" w:csb1="00000000"/>
-  </w:font>
-  <w:font w:name="Symbol">
-    <w:panose1 w:val="05050102010706020507"/>
-    <w:charset w:val="02"/>
-    <w:family w:val="roman"/>
-    <w:pitch w:val="variable"/>
-    <w:sig w:usb0="00000000" w:usb1="10000000" w:usb2="00000000" w:usb3="00000000" w:csb0="80000000" w:csb1="00000000"/>
-  </w:font>
-  <w:font w:name="Calibri Light">
-    <w:panose1 w:val="020F0302020204030204"/>
-    <w:charset w:val="00"/>
-    <w:family w:val="swiss"/>
-    <w:pitch w:val="variable"/>
-    <w:sig w:usb0="E4002EFF" w:usb1="C000247B" w:usb2="00000009" w:usb3="00000000" w:csb0="000001FF" w:csb1="00000000"/>
-  </w:font>
-  <w:font w:name="Segoe UI">
-    <w:panose1 w:val="020B0502040204020203"/>
-    <w:charset w:val="00"/>
-    <w:family w:val="swiss"/>
-    <w:pitch w:val="variable"/>
-    <w:sig w:usb0="E4002EFF" w:usb1="C000E47F" w:usb2="00000009" w:usb3="00000000" w:csb0="000001FF" w:csb1="00000000"/>
-  </w:font>
-  <w:font w:name="Century Gothic">
-    <w:panose1 w:val="020B0502020202020204"/>
-    <w:charset w:val="00"/>
-    <w:family w:val="swiss"/>
-    <w:pitch w:val="variable"/>
-    <w:sig w:usb0="00000287" w:usb1="00000000" w:usb2="00000000" w:usb3="00000000" w:csb0="0000009F" w:csb1="00000000"/>
-  </w:font>
-</w:fonts>
-</file>
-
-<file path=word/glossary/settings.xml><?xml version="1.0" encoding="utf-8"?>
-<w:settings xmlns:mc="http://schemas.openxmlformats.org/markup-compatibility/2006" xmlns:o="urn:schemas-microsoft-com:office:office" xmlns:r="http://schemas.openxmlformats.org/officeDocument/2006/relationships" xmlns:m="http://schemas.openxmlformats.org/officeDocument/2006/math" xmlns:v="urn:schemas-microsoft-com:vml" xmlns:w10="urn:schemas-microsoft-com:office:word" xmlns:w="http://schemas.openxmlformats.org/wordprocessingml/2006/main" xmlns:w14="http://schemas.microsoft.com/office/word/2010/wordml" xmlns:w15="http://schemas.microsoft.com/office/word/2012/wordml" xmlns:w16se="http://schemas.microsoft.com/office/word/2015/wordml/symex" xmlns:sl="http://schemas.openxmlformats.org/schemaLibrary/2006/main" mc:Ignorable="w14 w15 w16se">
-  <w:defaultTabStop w:val="708"/>
-  <w:hyphenationZone w:val="425"/>
-  <w:characterSpacingControl w:val="doNotCompress"/>
-  <w:compat>
-    <w:useFELayout/>
-    <w:compatSetting w:name="compatibilityMode" w:uri="http://schemas.microsoft.com/office/word" w:val="12"/>
-  </w:compat>
-  <w:rsids>
-    <w:rsidRoot w:val="008F14D6"/>
-    <w:rsid w:val="008F14D6"/>
-  </w:rsids>
-  <m:mathPr>
-    <m:mathFont m:val="Cambria Math"/>
-    <m:brkBin m:val="before"/>
-    <m:brkBinSub m:val="--"/>
-    <m:smallFrac m:val="0"/>
-    <m:dispDef/>
-    <m:lMargin m:val="0"/>
-    <m:rMargin m:val="0"/>
-    <m:defJc m:val="centerGroup"/>
-    <m:wrapIndent m:val="1440"/>
-    <m:intLim m:val="subSup"/>
-    <m:naryLim m:val="undOvr"/>
-  </m:mathPr>
-  <w:themeFontLang w:val="es-CL"/>
-  <w:clrSchemeMapping w:bg1="light1" w:t1="dark1" w:bg2="light2" w:t2="dark2" w:accent1="accent1" w:accent2="accent2" w:accent3="accent3" w:accent4="accent4" w:accent5="accent5" w:accent6="accent6" w:hyperlink="hyperlink" w:followedHyperlink="followedHyperlink"/>
-  <w:decimalSymbol w:val=","/>
-  <w:listSeparator w:val=";"/>
-</w:settings>
-</file>
-
-<file path=word/glossary/styles.xml><?xml version="1.0" encoding="utf-8"?>
-<w:styles xmlns:mc="http://schemas.openxmlformats.org/markup-compatibility/2006" xmlns:r="http://schemas.openxmlformats.org/officeDocument/2006/relationships" xmlns:w="http://schemas.openxmlformats.org/wordprocessingml/2006/main" xmlns:w14="http://schemas.microsoft.com/office/word/2010/wordml" xmlns:w15="http://schemas.microsoft.com/office/word/2012/wordml" xmlns:w16se="http://schemas.microsoft.com/office/word/2015/wordml/symex" mc:Ignorable="w14 w15 w16se">
-  <w:docDefaults>
-    <w:rPrDefault>
-      <w:rPr>
-        <w:rFonts w:asciiTheme="minorHAnsi" w:eastAsiaTheme="minorEastAsia" w:hAnsiTheme="minorHAnsi" w:cstheme="minorBidi"/>
-        <w:sz w:val="22"/>
-        <w:szCs w:val="22"/>
-        <w:lang w:val="es-CL" w:eastAsia="es-CL" w:bidi="ar-SA"/>
-      </w:rPr>
-    </w:rPrDefault>
-    <w:pPrDefault>
-      <w:pPr>
-        <w:spacing w:after="160" w:line="259" w:lineRule="auto"/>
-      </w:pPr>
-    </w:pPrDefault>
-  </w:docDefaults>
-  <w:latentStyles w:defLockedState="0" w:defUIPriority="99" w:defSemiHidden="0" w:defUnhideWhenUsed="0" w:defQFormat="0" w:count="371">
-    <w:lsdException w:name="Normal" w:uiPriority="0" w:qFormat="1"/>
-    <w:lsdException w:name="heading 1" w:uiPriority="9" w:qFormat="1"/>
-    <w:lsdException w:name="heading 2" w:semiHidden="1" w:uiPriority="9" w:unhideWhenUsed="1" w:qFormat="1"/>
-    <w:lsdException w:name="heading 3" w:semiHidden="1" w:uiPriority="9" w:unhideWhenUsed="1" w:qFormat="1"/>
-    <w:lsdException w:name="heading 4" w:semiHidden="1" w:uiPriority="9" w:unhideWhenUsed="1" w:qFormat="1"/>
-    <w:lsdException w:name="heading 5" w:semiHidden="1" w:uiPriority="9" w:unhideWhenUsed="1" w:qFormat="1"/>
-    <w:lsdException w:name="heading 6" w:semiHidden="1" w:uiPriority="9" w:unhideWhenUsed="1" w:qFormat="1"/>
-    <w:lsdException w:name="heading 7" w:semiHidden="1" w:uiPriority="9" w:unhideWhenUsed="1" w:qFormat="1"/>
-    <w:lsdException w:name="heading 8" w:semiHidden="1" w:uiPriority="9" w:unhideWhenUsed="1" w:qFormat="1"/>
-    <w:lsdException w:name="heading 9" w:semiHidden="1" w:uiPriority="9" w:unhideWhenUsed="1" w:qFormat="1"/>
-    <w:lsdException w:name="index 1" w:semiHidden="1" w:unhideWhenUsed="1"/>
-    <w:lsdException w:name="index 2" w:semiHidden="1" w:unhideWhenUsed="1"/>
-    <w:lsdException w:name="index 3" w:semiHidden="1" w:unhideWhenUsed="1"/>
-    <w:lsdException w:name="index 4" w:semiHidden="1" w:unhideWhenUsed="1"/>
-    <w:lsdException w:name="index 5" w:semiHidden="1" w:unhideWhenUsed="1"/>
-    <w:lsdException w:name="index 6" w:semiHidden="1" w:unhideWhenUsed="1"/>
-    <w:lsdException w:name="index 7" w:semiHidden="1" w:unhideWhenUsed="1"/>
-    <w:lsdException w:name="index 8" w:semiHidden="1" w:unhideWhenUsed="1"/>
-    <w:lsdException w:name="index 9" w:semiHidden="1" w:unhideWhenUsed="1"/>
-    <w:lsdException w:name="toc 1" w:semiHidden="1" w:uiPriority="39" w:unhideWhenUsed="1"/>
-    <w:lsdException w:name="toc 2" w:semiHidden="1" w:uiPriority="39" w:unhideWhenUsed="1"/>
-    <w:lsdException w:name="toc 3" w:semiHidden="1" w:uiPriority="39" w:unhideWhenUsed="1"/>
-    <w:lsdException w:name="toc 4" w:semiHidden="1" w:uiPriority="39" w:unhideWhenUsed="1"/>
-    <w:lsdException w:name="toc 5" w:semiHidden="1" w:uiPriority="39" w:unhideWhenUsed="1"/>
-    <w:lsdException w:name="toc 6" w:semiHidden="1" w:uiPriority="39" w:unhideWhenUsed="1"/>
-    <w:lsdException w:name="toc 7" w:semiHidden="1" w:uiPriority="39" w:unhideWhenUsed="1"/>
-    <w:lsdException w:name="toc 8" w:semiHidden="1" w:uiPriority="39" w:unhideWhenUsed="1"/>
-    <w:lsdException w:name="toc 9" w:semiHidden="1" w:uiPriority="39" w:unhideWhenUsed="1"/>
-    <w:lsdException w:name="Normal Indent" w:semiHidden="1" w:unhideWhenUsed="1"/>
-    <w:lsdException w:name="footnote text" w:semiHidden="1" w:unhideWhenUsed="1"/>
-    <w:lsdException w:name="annotation text" w:semiHidden="1" w:unhideWhenUsed="1"/>
-    <w:lsdException w:name="header" w:semiHidden="1" w:unhideWhenUsed="1"/>
-    <w:lsdException w:name="footer" w:semiHidden="1" w:unhideWhenUsed="1"/>
-    <w:lsdException w:name="index heading" w:semiHidden="1" w:unhideWhenUsed="1"/>
-    <w:lsdException w:name="caption" w:semiHidden="1" w:uiPriority="35" w:unhideWhenUsed="1" w:qFormat="1"/>
-    <w:lsdException w:name="table of figures" w:semiHidden="1" w:unhideWhenUsed="1"/>
-    <w:lsdException w:name="envelope address" w:semiHidden="1" w:unhideWhenUsed="1"/>
-    <w:lsdException w:name="envelope return" w:semiHidden="1" w:unhideWhenUsed="1"/>
-    <w:lsdException w:name="footnote reference" w:semiHidden="1" w:unhideWhenUsed="1"/>
-    <w:lsdException w:name="annotation reference" w:semiHidden="1" w:unhideWhenUsed="1"/>
-    <w:lsdException w:name="line number" w:semiHidden="1" w:unhideWhenUsed="1"/>
-    <w:lsdException w:name="page number" w:semiHidden="1" w:unhideWhenUsed="1"/>
-    <w:lsdException w:name="endnote reference" w:semiHidden="1" w:unhideWhenUsed="1"/>
-    <w:lsdException w:name="endnote text" w:semiHidden="1" w:unhideWhenUsed="1"/>
-    <w:lsdException w:name="table of authorities" w:semiHidden="1" w:unhideWhenUsed="1"/>
-    <w:lsdException w:name="macro" w:semiHidden="1" w:unhideWhenUsed="1"/>
-    <w:lsdException w:name="toa heading" w:semiHidden="1" w:unhideWhenUsed="1"/>
-    <w:lsdException w:name="List" w:semiHidden="1" w:unhideWhenUsed="1"/>
-    <w:lsdException w:name="List Bullet" w:semiHidden="1" w:unhideWhenUsed="1"/>
-    <w:lsdException w:name="List Number" w:semiHidden="1" w:unhideWhenUsed="1"/>
-    <w:lsdException w:name="List 2" w:semiHidden="1" w:unhideWhenUsed="1"/>
-    <w:lsdException w:name="List 3" w:semiHidden="1" w:unhideWhenUsed="1"/>
-    <w:lsdException w:name="List 4" w:semiHidden="1" w:unhideWhenUsed="1"/>
-    <w:lsdException w:name="List 5" w:semiHidden="1" w:unhideWhenUsed="1"/>
-    <w:lsdException w:name="List Bullet 2" w:semiHidden="1" w:unhideWhenUsed="1"/>
-    <w:lsdException w:name="List Bullet 3" w:semiHidden="1" w:unhideWhenUsed="1"/>
-    <w:lsdException w:name="List Bullet 4" w:semiHidden="1" w:unhideWhenUsed="1"/>
-    <w:lsdException w:name="List Bullet 5" w:semiHidden="1" w:unhideWhenUsed="1"/>
-    <w:lsdException w:name="List Number 2" w:semiHidden="1" w:unhideWhenUsed="1"/>
-    <w:lsdException w:name="List Number 3" w:semiHidden="1" w:unhideWhenUsed="1"/>
-    <w:lsdException w:name="List Number 4" w:semiHidden="1" w:unhideWhenUsed="1"/>
-    <w:lsdException w:name="List Number 5" w:semiHidden="1" w:unhideWhenUsed="1"/>
-    <w:lsdException w:name="Title" w:uiPriority="10" w:qFormat="1"/>
-    <w:lsdException w:name="Closing" w:semiHidden="1" w:unhideWhenUsed="1"/>
-    <w:lsdException w:name="Signature" w:semiHidden="1" w:unhideWhenUsed="1"/>
-    <w:lsdException w:name="Default Paragraph Font" w:semiHidden="1" w:uiPriority="1" w:unhideWhenUsed="1"/>
-    <w:lsdException w:name="Body Text" w:semiHidden="1" w:unhideWhenUsed="1"/>
-    <w:lsdException w:name="Body Text Indent" w:semiHidden="1" w:unhideWhenUsed="1"/>
-    <w:lsdException w:name="List Continue" w:semiHidden="1" w:unhideWhenUsed="1"/>
-    <w:lsdException w:name="List Continue 2" w:semiHidden="1" w:unhideWhenUsed="1"/>
-    <w:lsdException w:name="List Continue 3" w:semiHidden="1" w:unhideWhenUsed="1"/>
-    <w:lsdException w:name="List Continue 4" w:semiHidden="1" w:unhideWhenUsed="1"/>
-    <w:lsdException w:name="List Continue 5" w:semiHidden="1" w:unhideWhenUsed="1"/>
-    <w:lsdException w:name="Message Header" w:semiHidden="1" w:unhideWhenUsed="1"/>
-    <w:lsdException w:name="Subtitle" w:uiPriority="11" w:qFormat="1"/>
-    <w:lsdException w:name="Salutation" w:semiHidden="1" w:unhideWhenUsed="1"/>
-    <w:lsdException w:name="Date" w:semiHidden="1" w:unhideWhenUsed="1"/>
-    <w:lsdException w:name="Body Text First Indent" w:semiHidden="1" w:unhideWhenUsed="1"/>
-    <w:lsdException w:name="Body Text First Indent 2" w:semiHidden="1" w:unhideWhenUsed="1"/>
-    <w:lsdException w:name="Note Heading" w:semiHidden="1" w:unhideWhenUsed="1"/>
-    <w:lsdException w:name="Body Text 2" w:semiHidden="1" w:unhideWhenUsed="1"/>
-    <w:lsdException w:name="Body Text 3" w:semiHidden="1" w:unhideWhenUsed="1"/>
-    <w:lsdException w:name="Body Text Indent 2" w:semiHidden="1" w:unhideWhenUsed="1"/>
-    <w:lsdException w:name="Body Text Indent 3" w:semiHidden="1" w:unhideWhenUsed="1"/>
-    <w:lsdException w:name="Block Text" w:semiHidden="1" w:unhideWhenUsed="1"/>
-    <w:lsdException w:name="Hyperlink" w:semiHidden="1" w:unhideWhenUsed="1"/>
-    <w:lsdException w:name="FollowedHyperlink" w:semiHidden="1" w:unhideWhenUsed="1"/>
-    <w:lsdException w:name="Strong" w:uiPriority="22" w:qFormat="1"/>
-    <w:lsdException w:name="Emphasis" w:uiPriority="20" w:qFormat="1"/>
-    <w:lsdException w:name="Document Map" w:semiHidden="1" w:unhideWhenUsed="1"/>
-    <w:lsdException w:name="Plain Text" w:semiHidden="1" w:unhideWhenUsed="1"/>
-    <w:lsdException w:name="E-mail Signature" w:semiHidden="1" w:unhideWhenUsed="1"/>
-    <w:lsdException w:name="HTML Top of Form" w:semiHidden="1" w:unhideWhenUsed="1"/>
-    <w:lsdException w:name="HTML Bottom of Form" w:semiHidden="1" w:unhideWhenUsed="1"/>
-    <w:lsdException w:name="Normal (Web)" w:semiHidden="1" w:unhideWhenUsed="1"/>
-    <w:lsdException w:name="HTML Acronym" w:semiHidden="1" w:unhideWhenUsed="1"/>
-    <w:lsdException w:name="HTML Address" w:semiHidden="1" w:unhideWhenUsed="1"/>
-    <w:lsdException w:name="HTML Cite" w:semiHidden="1" w:unhideWhenUsed="1"/>
-    <w:lsdException w:name="HTML Code" w:semiHidden="1" w:unhideWhenUsed="1"/>
-    <w:lsdException w:name="HTML Definition" w:semiHidden="1" w:unhideWhenUsed="1"/>
-    <w:lsdException w:name="HTML Keyboard" w:semiHidden="1" w:unhideWhenUsed="1"/>
-    <w:lsdException w:name="HTML Preformatted" w:semiHidden="1" w:unhideWhenUsed="1"/>
-    <w:lsdException w:name="HTML Sample" w:semiHidden="1" w:unhideWhenUsed="1"/>
-    <w:lsdException w:name="HTML Typewriter" w:semiHidden="1" w:unhideWhenUsed="1"/>
-    <w:lsdException w:name="HTML Variable" w:semiHidden="1" w:unhideWhenUsed="1"/>
-    <w:lsdException w:name="Normal Table" w:semiHidden="1" w:unhideWhenUsed="1"/>
-    <w:lsdException w:name="annotation subject" w:semiHidden="1" w:unhideWhenUsed="1"/>
-    <w:lsdException w:name="No List" w:semiHidden="1" w:unhideWhenUsed="1"/>
-    <w:lsdException w:name="Outline List 1" w:semiHidden="1" w:unhideWhenUsed="1"/>
-    <w:lsdException w:name="Outline List 2" w:semiHidden="1" w:unhideWhenUsed="1"/>
-    <w:lsdException w:name="Outline List 3" w:semiHidden="1" w:unhideWhenUsed="1"/>
-    <w:lsdException w:name="Table Simple 1" w:semiHidden="1" w:unhideWhenUsed="1"/>
-    <w:lsdException w:name="Table Simple 2" w:semiHidden="1" w:unhideWhenUsed="1"/>
-    <w:lsdException w:name="Table Simple 3" w:semiHidden="1" w:unhideWhenUsed="1"/>
-    <w:lsdException w:name="Table Classic 1" w:semiHidden="1" w:unhideWhenUsed="1"/>
-    <w:lsdException w:name="Table Classic 2" w:semiHidden="1" w:unhideWhenUsed="1"/>
-    <w:lsdException w:name="Table Classic 3" w:semiHidden="1" w:unhideWhenUsed="1"/>
-    <w:lsdException w:name="Table Classic 4" w:semiHidden="1" w:unhideWhenUsed="1"/>
-    <w:lsdException w:name="Table Colorful 1" w:semiHidden="1" w:unhideWhenUsed="1"/>
-    <w:lsdException w:name="Table Colorful 2" w:semiHidden="1" w:unhideWhenUsed="1"/>
-    <w:lsdException w:name="Table Colorful 3" w:semiHidden="1" w:unhideWhenUsed="1"/>
-    <w:lsdException w:name="Table Columns 1" w:semiHidden="1" w:unhideWhenUsed="1"/>
-    <w:lsdException w:name="Table Columns 2" w:semiHidden="1" w:unhideWhenUsed="1"/>
-    <w:lsdException w:name="Table Columns 3" w:semiHidden="1" w:unhideWhenUsed="1"/>
-    <w:lsdException w:name="Table Columns 4" w:semiHidden="1" w:unhideWhenUsed="1"/>
-    <w:lsdException w:name="Table Columns 5" w:semiHidden="1" w:unhideWhenUsed="1"/>
-    <w:lsdException w:name="Table Grid 1" w:semiHidden="1" w:unhideWhenUsed="1"/>
-    <w:lsdException w:name="Table Grid 2" w:semiHidden="1" w:unhideWhenUsed="1"/>
-    <w:lsdException w:name="Table Grid 3" w:semiHidden="1" w:unhideWhenUsed="1"/>
-    <w:lsdException w:name="Table Grid 4" w:semiHidden="1" w:unhideWhenUsed="1"/>
-    <w:lsdException w:name="Table Grid 5" w:semiHidden="1" w:unhideWhenUsed="1"/>
-    <w:lsdException w:name="Table Grid 6" w:semiHidden="1" w:unhideWhenUsed="1"/>
-    <w:lsdException w:name="Table Grid 7" w:semiHidden="1" w:unhideWhenUsed="1"/>
-    <w:lsdException w:name="Table Grid 8" w:semiHidden="1" w:unhideWhenUsed="1"/>
-    <w:lsdException w:name="Table List 1" w:semiHidden="1" w:unhideWhenUsed="1"/>
-    <w:lsdException w:name="Table List 2" w:semiHidden="1" w:unhideWhenUsed="1"/>
-    <w:lsdException w:name="Table List 3" w:semiHidden="1" w:unhideWhenUsed="1"/>
-    <w:lsdException w:name="Table List 4" w:semiHidden="1" w:unhideWhenUsed="1"/>
-    <w:lsdException w:name="Table List 5" w:semiHidden="1" w:unhideWhenUsed="1"/>
-    <w:lsdException w:name="Table List 6" w:semiHidden="1" w:unhideWhenUsed="1"/>
-    <w:lsdException w:name="Table List 7" w:semiHidden="1" w:unhideWhenUsed="1"/>
-    <w:lsdException w:name="Table List 8" w:semiHidden="1" w:unhideWhenUsed="1"/>
-    <w:lsdException w:name="Table 3D effects 1" w:semiHidden="1" w:unhideWhenUsed="1"/>
-    <w:lsdException w:name="Table 3D effects 2" w:semiHidden="1" w:unhideWhenUsed="1"/>
-    <w:lsdException w:name="Table 3D effects 3" w:semiHidden="1" w:unhideWhenUsed="1"/>
-    <w:lsdException w:name="Table Contemporary" w:semiHidden="1" w:unhideWhenUsed="1"/>
-    <w:lsdException w:name="Table Elegant" w:semiHidden="1" w:unhideWhenUsed="1"/>
-    <w:lsdException w:name="Table Professional" w:semiHidden="1" w:unhideWhenUsed="1"/>
-    <w:lsdException w:name="Table Subtle 1" w:semiHidden="1" w:unhideWhenUsed="1"/>
-    <w:lsdException w:name="Table Subtle 2" w:semiHidden="1" w:unhideWhenUsed="1"/>
-    <w:lsdException w:name="Table Web 1" w:semiHidden="1" w:unhideWhenUsed="1"/>
-    <w:lsdException w:name="Table Web 2" w:semiHidden="1" w:unhideWhenUsed="1"/>
-    <w:lsdException w:name="Table Web 3" w:semiHidden="1" w:unhideWhenUsed="1"/>
-    <w:lsdException w:name="Balloon Text" w:semiHidden="1" w:unhideWhenUsed="1"/>
-    <w:lsdException w:name="Table Grid" w:uiPriority="39"/>
-    <w:lsdException w:name="Table Theme" w:semiHidden="1" w:unhideWhenUsed="1"/>
-    <w:lsdException w:name="Placeholder Text" w:semiHidden="1"/>
-    <w:lsdException w:name="No Spacing" w:uiPriority="1" w:qFormat="1"/>
-    <w:lsdException w:name="Light Shading" w:uiPriority="60"/>
-    <w:lsdException w:name="Light List" w:uiPriority="61"/>
-    <w:lsdException w:name="Light Grid" w:uiPriority="62"/>
-    <w:lsdException w:name="Medium Shading 1" w:uiPriority="63"/>
-    <w:lsdException w:name="Medium Shading 2" w:uiPriority="64"/>
-    <w:lsdException w:name="Medium List 1" w:uiPriority="65"/>
-    <w:lsdException w:name="Medium List 2" w:uiPriority="66"/>
-    <w:lsdException w:name="Medium Grid 1" w:uiPriority="67"/>
-    <w:lsdException w:name="Medium Grid 2" w:uiPriority="68"/>
-    <w:lsdException w:name="Medium Grid 3" w:uiPriority="69"/>
-    <w:lsdException w:name="Dark List" w:uiPriority="70"/>
-    <w:lsdException w:name="Colorful Shading" w:uiPriority="71"/>
-    <w:lsdException w:name="Colorful List" w:uiPriority="72"/>
-    <w:lsdException w:name="Colorful Grid" w:uiPriority="73"/>
-    <w:lsdException w:name="Light Shading Accent 1" w:uiPriority="60"/>
-    <w:lsdException w:name="Light List Accent 1" w:uiPriority="61"/>
-    <w:lsdException w:name="Light Grid Accent 1" w:uiPriority="62"/>
-    <w:lsdException w:name="Medium Shading 1 Accent 1" w:uiPriority="63"/>
-    <w:lsdException w:name="Medium Shading 2 Accent 1" w:uiPriority="64"/>
-    <w:lsdException w:name="Medium List 1 Accent 1" w:uiPriority="65"/>
-    <w:lsdException w:name="Revision" w:semiHidden="1"/>
-    <w:lsdException w:name="List Paragraph" w:uiPriority="34" w:qFormat="1"/>
-    <w:lsdException w:name="Quote" w:uiPriority="29" w:qFormat="1"/>
-    <w:lsdException w:name="Intense Quote" w:uiPriority="30" w:qFormat="1"/>
-    <w:lsdException w:name="Medium List 2 Accent 1" w:uiPriority="66"/>
-    <w:lsdException w:name="Medium Grid 1 Accent 1" w:uiPriority="67"/>
-    <w:lsdException w:name="Medium Grid 2 Accent 1" w:uiPriority="68"/>
-    <w:lsdException w:name="Medium Grid 3 Accent 1" w:uiPriority="69"/>
-    <w:lsdException w:name="Dark List Accent 1" w:uiPriority="70"/>
-    <w:lsdException w:name="Colorful Shading Accent 1" w:uiPriority="71"/>
-    <w:lsdException w:name="Colorful List Accent 1" w:uiPriority="72"/>
-    <w:lsdException w:name="Colorful Grid Accent 1" w:uiPriority="73"/>
-    <w:lsdException w:name="Light Shading Accent 2" w:uiPriority="60"/>
-    <w:lsdException w:name="Light List Accent 2" w:uiPriority="61"/>
-    <w:lsdException w:name="Light Grid Accent 2" w:uiPriority="62"/>
-    <w:lsdException w:name="Medium Shading 1 Accent 2" w:uiPriority="63"/>
-    <w:lsdException w:name="Medium Shading 2 Accent 2" w:uiPriority="64"/>
-    <w:lsdException w:name="Medium List 1 Accent 2" w:uiPriority="65"/>
-    <w:lsdException w:name="Medium List 2 Accent 2" w:uiPriority="66"/>
-    <w:lsdException w:name="Medium Grid 1 Accent 2" w:uiPriority="67"/>
-    <w:lsdException w:name="Medium Grid 2 Accent 2" w:uiPriority="68"/>
-    <w:lsdException w:name="Medium Grid 3 Accent 2" w:uiPriority="69"/>
-    <w:lsdException w:name="Dark List Accent 2" w:uiPriority="70"/>
-    <w:lsdException w:name="Colorful Shading Accent 2" w:uiPriority="71"/>
-    <w:lsdException w:name="Colorful List Accent 2" w:uiPriority="72"/>
-    <w:lsdException w:name="Colorful Grid Accent 2" w:uiPriority="73"/>
-    <w:lsdException w:name="Light Shading Accent 3" w:uiPriority="60"/>
-    <w:lsdException w:name="Light List Accent 3" w:uiPriority="61"/>
-    <w:lsdException w:name="Light Grid Accent 3" w:uiPriority="62"/>
-    <w:lsdException w:name="Medium Shading 1 Accent 3" w:uiPriority="63"/>
-    <w:lsdException w:name="Medium Shading 2 Accent 3" w:uiPriority="64"/>
-    <w:lsdException w:name="Medium List 1 Accent 3" w:uiPriority="65"/>
-    <w:lsdException w:name="Medium List 2 Accent 3" w:uiPriority="66"/>
-    <w:lsdException w:name="Medium Grid 1 Accent 3" w:uiPriority="67"/>
-    <w:lsdException w:name="Medium Grid 2 Accent 3" w:uiPriority="68"/>
-    <w:lsdException w:name="Medium Grid 3 Accent 3" w:uiPriority="69"/>
-    <w:lsdException w:name="Dark List Accent 3" w:uiPriority="70"/>
-    <w:lsdException w:name="Colorful Shading Accent 3" w:uiPriority="71"/>
-    <w:lsdException w:name="Colorful List Accent 3" w:uiPriority="72"/>
-    <w:lsdException w:name="Colorful Grid Accent 3" w:uiPriority="73"/>
-    <w:lsdException w:name="Light Shading Accent 4" w:uiPriority="60"/>
-    <w:lsdException w:name="Light List Accent 4" w:uiPriority="61"/>
-    <w:lsdException w:name="Light Grid Accent 4" w:uiPriority="62"/>
-    <w:lsdException w:name="Medium Shading 1 Accent 4" w:uiPriority="63"/>
-    <w:lsdException w:name="Medium Shading 2 Accent 4" w:uiPriority="64"/>
-    <w:lsdException w:name="Medium List 1 Accent 4" w:uiPriority="65"/>
-    <w:lsdException w:name="Medium List 2 Accent 4" w:uiPriority="66"/>
-    <w:lsdException w:name="Medium Grid 1 Accent 4" w:uiPriority="67"/>
-    <w:lsdException w:name="Medium Grid 2 Accent 4" w:uiPriority="68"/>
-    <w:lsdException w:name="Medium Grid 3 Accent 4" w:uiPriority="69"/>
-    <w:lsdException w:name="Dark List Accent 4" w:uiPriority="70"/>
-    <w:lsdException w:name="Colorful Shading Accent 4" w:uiPriority="71"/>
-    <w:lsdException w:name="Colorful List Accent 4" w:uiPriority="72"/>
-    <w:lsdException w:name="Colorful Grid Accent 4" w:uiPriority="73"/>
-    <w:lsdException w:name="Light Shading Accent 5" w:uiPriority="60"/>
-    <w:lsdException w:name="Light List Accent 5" w:uiPriority="61"/>
-    <w:lsdException w:name="Light Grid Accent 5" w:uiPriority="62"/>
-    <w:lsdException w:name="Medium Shading 1 Accent 5" w:uiPriority="63"/>
-    <w:lsdException w:name="Medium Shading 2 Accent 5" w:uiPriority="64"/>
-    <w:lsdException w:name="Medium List 1 Accent 5" w:uiPriority="65"/>
-    <w:lsdException w:name="Medium List 2 Accent 5" w:uiPriority="66"/>
-    <w:lsdException w:name="Medium Grid 1 Accent 5" w:uiPriority="67"/>
-    <w:lsdException w:name="Medium Grid 2 Accent 5" w:uiPriority="68"/>
-    <w:lsdException w:name="Medium Grid 3 Accent 5" w:uiPriority="69"/>
-    <w:lsdException w:name="Dark List Accent 5" w:uiPriority="70"/>
-    <w:lsdException w:name="Colorful Shading Accent 5" w:uiPriority="71"/>
-    <w:lsdException w:name="Colorful List Accent 5" w:uiPriority="72"/>
-    <w:lsdException w:name="Colorful Grid Accent 5" w:uiPriority="73"/>
-    <w:lsdException w:name="Light Shading Accent 6" w:uiPriority="60"/>
-    <w:lsdException w:name="Light List Accent 6" w:uiPriority="61"/>
-    <w:lsdException w:name="Light Grid Accent 6" w:uiPriority="62"/>
-    <w:lsdException w:name="Medium Shading 1 Accent 6" w:uiPriority="63"/>
-    <w:lsdException w:name="Medium Shading 2 Accent 6" w:uiPriority="64"/>
-    <w:lsdException w:name="Medium List 1 Accent 6" w:uiPriority="65"/>
-    <w:lsdException w:name="Medium List 2 Accent 6" w:uiPriority="66"/>
-    <w:lsdException w:name="Medium Grid 1 Accent 6" w:uiPriority="67"/>
-    <w:lsdException w:name="Medium Grid 2 Accent 6" w:uiPriority="68"/>
-    <w:lsdException w:name="Medium Grid 3 Accent 6" w:uiPriority="69"/>
-    <w:lsdException w:name="Dark List Accent 6" w:uiPriority="70"/>
-    <w:lsdException w:name="Colorful Shading Accent 6" w:uiPriority="71"/>
-    <w:lsdException w:name="Colorful List Accent 6" w:uiPriority="72"/>
-    <w:lsdException w:name="Colorful Grid Accent 6" w:uiPriority="73"/>
-    <w:lsdException w:name="Subtle Emphasis" w:uiPriority="19" w:qFormat="1"/>
-    <w:lsdException w:name="Intense Emphasis" w:uiPriority="21" w:qFormat="1"/>
-    <w:lsdException w:name="Subtle Reference" w:uiPriority="31" w:qFormat="1"/>
-    <w:lsdException w:name="Intense Reference" w:uiPriority="32" w:qFormat="1"/>
-    <w:lsdException w:name="Book Title" w:uiPriority="33" w:qFormat="1"/>
-    <w:lsdException w:name="Bibliography" w:semiHidden="1" w:uiPriority="37" w:unhideWhenUsed="1"/>
-    <w:lsdException w:name="TOC Heading" w:semiHidden="1" w:uiPriority="39" w:unhideWhenUsed="1" w:qFormat="1"/>
-    <w:lsdException w:name="Plain Table 1" w:uiPriority="41"/>
-    <w:lsdException w:name="Plain Table 2" w:uiPriority="42"/>
-    <w:lsdException w:name="Plain Table 3" w:uiPriority="43"/>
-    <w:lsdException w:name="Plain Table 4" w:uiPriority="44"/>
-    <w:lsdException w:name="Plain Table 5" w:uiPriority="45"/>
-    <w:lsdException w:name="Grid Table Light" w:uiPriority="40"/>
-    <w:lsdException w:name="Grid Table 1 Light" w:uiPriority="46"/>
-    <w:lsdException w:name="Grid Table 2" w:uiPriority="47"/>
-    <w:lsdException w:name="Grid Table 3" w:uiPriority="48"/>
-    <w:lsdException w:name="Grid Table 4" w:uiPriority="49"/>
-    <w:lsdException w:name="Grid Table 5 Dark" w:uiPriority="50"/>
-    <w:lsdException w:name="Grid Table 6 Colorful" w:uiPriority="51"/>
-    <w:lsdException w:name="Grid Table 7 Colorful" w:uiPriority="52"/>
-    <w:lsdException w:name="Grid Table 1 Light Accent 1" w:uiPriority="46"/>
-    <w:lsdException w:name="Grid Table 2 Accent 1" w:uiPriority="47"/>
-    <w:lsdException w:name="Grid Table 3 Accent 1" w:uiPriority="48"/>
-    <w:lsdException w:name="Grid Table 4 Accent 1" w:uiPriority="49"/>
-    <w:lsdException w:name="Grid Table 5 Dark Accent 1" w:uiPriority="50"/>
-    <w:lsdException w:name="Grid Table 6 Colorful Accent 1" w:uiPriority="51"/>
-    <w:lsdException w:name="Grid Table 7 Colorful Accent 1" w:uiPriority="52"/>
-    <w:lsdException w:name="Grid Table 1 Light Accent 2" w:uiPriority="46"/>
-    <w:lsdException w:name="Grid Table 2 Accent 2" w:uiPriority="47"/>
-    <w:lsdException w:name="Grid Table 3 Accent 2" w:uiPriority="48"/>
-    <w:lsdException w:name="Grid Table 4 Accent 2" w:uiPriority="49"/>
-    <w:lsdException w:name="Grid Table 5 Dark Accent 2" w:uiPriority="50"/>
-    <w:lsdException w:name="Grid Table 6 Colorful Accent 2" w:uiPriority="51"/>
-    <w:lsdException w:name="Grid Table 7 Colorful Accent 2" w:uiPriority="52"/>
-    <w:lsdException w:name="Grid Table 1 Light Accent 3" w:uiPriority="46"/>
-    <w:lsdException w:name="Grid Table 2 Accent 3" w:uiPriority="47"/>
-    <w:lsdException w:name="Grid Table 3 Accent 3" w:uiPriority="48"/>
-    <w:lsdException w:name="Grid Table 4 Accent 3" w:uiPriority="49"/>
-    <w:lsdException w:name="Grid Table 5 Dark Accent 3" w:uiPriority="50"/>
-    <w:lsdException w:name="Grid Table 6 Colorful Accent 3" w:uiPriority="51"/>
-    <w:lsdException w:name="Grid Table 7 Colorful Accent 3" w:uiPriority="52"/>
-    <w:lsdException w:name="Grid Table 1 Light Accent 4" w:uiPriority="46"/>
-    <w:lsdException w:name="Grid Table 2 Accent 4" w:uiPriority="47"/>
-    <w:lsdException w:name="Grid Table 3 Accent 4" w:uiPriority="48"/>
-    <w:lsdException w:name="Grid Table 4 Accent 4" w:uiPriority="49"/>
-    <w:lsdException w:name="Grid Table 5 Dark Accent 4" w:uiPriority="50"/>
-    <w:lsdException w:name="Grid Table 6 Colorful Accent 4" w:uiPriority="51"/>
-    <w:lsdException w:name="Grid Table 7 Colorful Accent 4" w:uiPriority="52"/>
-    <w:lsdException w:name="Grid Table 1 Light Accent 5" w:uiPriority="46"/>
-    <w:lsdException w:name="Grid Table 2 Accent 5" w:uiPriority="47"/>
-    <w:lsdException w:name="Grid Table 3 Accent 5" w:uiPriority="48"/>
-    <w:lsdException w:name="Grid Table 4 Accent 5" w:uiPriority="49"/>
-    <w:lsdException w:name="Grid Table 5 Dark Accent 5" w:uiPriority="50"/>
-    <w:lsdException w:name="Grid Table 6 Colorful Accent 5" w:uiPriority="51"/>
-    <w:lsdException w:name="Grid Table 7 Colorful Accent 5" w:uiPriority="52"/>
-    <w:lsdException w:name="Grid Table 1 Light Accent 6" w:uiPriority="46"/>
-    <w:lsdException w:name="Grid Table 2 Accent 6" w:uiPriority="47"/>
-    <w:lsdException w:name="Grid Table 3 Accent 6" w:uiPriority="48"/>
-    <w:lsdException w:name="Grid Table 4 Accent 6" w:uiPriority="49"/>
-    <w:lsdException w:name="Grid Table 5 Dark Accent 6" w:uiPriority="50"/>
-    <w:lsdException w:name="Grid Table 6 Colorful Accent 6" w:uiPriority="51"/>
-    <w:lsdException w:name="Grid Table 7 Colorful Accent 6" w:uiPriority="52"/>
-    <w:lsdException w:name="List Table 1 Light" w:uiPriority="46"/>
-    <w:lsdException w:name="List Table 2" w:uiPriority="47"/>
-    <w:lsdException w:name="List Table 3" w:uiPriority="48"/>
-    <w:lsdException w:name="List Table 4" w:uiPriority="49"/>
-    <w:lsdException w:name="List Table 5 Dark" w:uiPriority="50"/>
-    <w:lsdException w:name="List Table 6 Colorful" w:uiPriority="51"/>
-    <w:lsdException w:name="List Table 7 Colorful" w:uiPriority="52"/>
-    <w:lsdException w:name="List Table 1 Light Accent 1" w:uiPriority="46"/>
-    <w:lsdException w:name="List Table 2 Accent 1" w:uiPriority="47"/>
-    <w:lsdException w:name="List Table 3 Accent 1" w:uiPriority="48"/>
-    <w:lsdException w:name="List Table 4 Accent 1" w:uiPriority="49"/>
-    <w:lsdException w:name="List Table 5 Dark Accent 1" w:uiPriority="50"/>
-    <w:lsdException w:name="List Table 6 Colorful Accent 1" w:uiPriority="51"/>
-    <w:lsdException w:name="List Table 7 Colorful Accent 1" w:uiPriority="52"/>
-    <w:lsdException w:name="List Table 1 Light Accent 2" w:uiPriority="46"/>
-    <w:lsdException w:name="List Table 2 Accent 2" w:uiPriority="47"/>
-    <w:lsdException w:name="List Table 3 Accent 2" w:uiPriority="48"/>
-    <w:lsdException w:name="List Table 4 Accent 2" w:uiPriority="49"/>
-    <w:lsdException w:name="List Table 5 Dark Accent 2" w:uiPriority="50"/>
-    <w:lsdException w:name="List Table 6 Colorful Accent 2" w:uiPriority="51"/>
-    <w:lsdException w:name="List Table 7 Colorful Accent 2" w:uiPriority="52"/>
-    <w:lsdException w:name="List Table 1 Light Accent 3" w:uiPriority="46"/>
-    <w:lsdException w:name="List Table 2 Accent 3" w:uiPriority="47"/>
-    <w:lsdException w:name="List Table 3 Accent 3" w:uiPriority="48"/>
-    <w:lsdException w:name="List Table 4 Accent 3" w:uiPriority="49"/>
-    <w:lsdException w:name="List Table 5 Dark Accent 3" w:uiPriority="50"/>
-    <w:lsdException w:name="List Table 6 Colorful Accent 3" w:uiPriority="51"/>
-    <w:lsdException w:name="List Table 7 Colorful Accent 3" w:uiPriority="52"/>
-    <w:lsdException w:name="List Table 1 Light Accent 4" w:uiPriority="46"/>
-    <w:lsdException w:name="List Table 2 Accent 4" w:uiPriority="47"/>
-    <w:lsdException w:name="List Table 3 Accent 4" w:uiPriority="48"/>
-    <w:lsdException w:name="List Table 4 Accent 4" w:uiPriority="49"/>
-    <w:lsdException w:name="List Table 5 Dark Accent 4" w:uiPriority="50"/>
-    <w:lsdException w:name="List Table 6 Colorful Accent 4" w:uiPriority="51"/>
-    <w:lsdException w:name="List Table 7 Colorful Accent 4" w:uiPriority="52"/>
-    <w:lsdException w:name="List Table 1 Light Accent 5" w:uiPriority="46"/>
-    <w:lsdException w:name="List Table 2 Accent 5" w:uiPriority="47"/>
-    <w:lsdException w:name="List Table 3 Accent 5" w:uiPriority="48"/>
-    <w:lsdException w:name="List Table 4 Accent 5" w:uiPriority="49"/>
-    <w:lsdException w:name="List Table 5 Dark Accent 5" w:uiPriority="50"/>
-    <w:lsdException w:name="List Table 6 Colorful Accent 5" w:uiPriority="51"/>
-    <w:lsdException w:name="List Table 7 Colorful Accent 5" w:uiPriority="52"/>
-    <w:lsdException w:name="List Table 1 Light Accent 6" w:uiPriority="46"/>
-    <w:lsdException w:name="List Table 2 Accent 6" w:uiPriority="47"/>
-    <w:lsdException w:name="List Table 3 Accent 6" w:uiPriority="48"/>
-    <w:lsdException w:name="List Table 4 Accent 6" w:uiPriority="49"/>
-    <w:lsdException w:name="List Table 5 Dark Accent 6" w:uiPriority="50"/>
-    <w:lsdException w:name="List Table 6 Colorful Accent 6" w:uiPriority="51"/>
-    <w:lsdException w:name="List Table 7 Colorful Accent 6" w:uiPriority="52"/>
-  </w:latentStyles>
-  <w:style w:type="paragraph" w:default="1" w:styleId="Normal">
-    <w:name w:val="Normal"/>
-    <w:qFormat/>
-  </w:style>
-  <w:style w:type="character" w:default="1" w:styleId="Fuentedeprrafopredeter">
-    <w:name w:val="Default Paragraph Font"/>
-    <w:uiPriority w:val="1"/>
-    <w:semiHidden/>
-    <w:unhideWhenUsed/>
-  </w:style>
-  <w:style w:type="table" w:default="1" w:styleId="Tablanormal">
-    <w:name w:val="Normal Table"/>
-    <w:uiPriority w:val="99"/>
-    <w:semiHidden/>
-    <w:unhideWhenUsed/>
-    <w:tblPr>
-      <w:tblInd w:w="0" w:type="dxa"/>
-      <w:tblCellMar>
-        <w:top w:w="0" w:type="dxa"/>
-        <w:left w:w="108" w:type="dxa"/>
-        <w:bottom w:w="0" w:type="dxa"/>
-        <w:right w:w="108" w:type="dxa"/>
-      </w:tblCellMar>
-    </w:tblPr>
-  </w:style>
-  <w:style w:type="numbering" w:default="1" w:styleId="Sinlista">
-    <w:name w:val="No List"/>
-    <w:uiPriority w:val="99"/>
-    <w:semiHidden/>
-    <w:unhideWhenUsed/>
-  </w:style>
-</w:styles>
-</file>
-
-<file path=word/glossary/webSettings.xml><?xml version="1.0" encoding="utf-8"?>
-<w:webSettings xmlns:mc="http://schemas.openxmlformats.org/markup-compatibility/2006" xmlns:r="http://schemas.openxmlformats.org/officeDocument/2006/relationships" xmlns:w="http://schemas.openxmlformats.org/wordprocessingml/2006/main" xmlns:w14="http://schemas.microsoft.com/office/word/2010/wordml" xmlns:w15="http://schemas.microsoft.com/office/word/2012/wordml" xmlns:w16se="http://schemas.microsoft.com/office/word/2015/wordml/symex" mc:Ignorable="w14 w15 w16se"/>
 </file>
 
 <file path=word/theme/theme1.xml><?xml version="1.0" encoding="utf-8"?>
@@ -8698,6 +8861,12 @@
 </file>
 
 <file path=customXml/item1.xml><?xml version="1.0" encoding="utf-8"?>
+<p:properties xmlns:p="http://schemas.microsoft.com/office/2006/metadata/properties" xmlns:xsi="http://www.w3.org/2001/XMLSchema-instance" xmlns:pc="http://schemas.microsoft.com/office/infopath/2007/PartnerControls">
+  <documentManagement/>
+</p:properties>
+</file>
+
+<file path=customXml/item2.xml><?xml version="1.0" encoding="utf-8"?>
 <ct:contentTypeSchema xmlns:ct="http://schemas.microsoft.com/office/2006/metadata/contentType" xmlns:ma="http://schemas.microsoft.com/office/2006/metadata/properties/metaAttributes" ct:_="" ma:_="" ma:contentTypeName="Documento" ma:contentTypeID="0x010100E96778489EE7714D8BD12CC105EB918B" ma:contentTypeVersion="2" ma:contentTypeDescription="Crear nuevo documento." ma:contentTypeScope="" ma:versionID="416c5c7ae9b5d54d83875cd3c65194e3">
   <xsd:schema xmlns:xsd="http://www.w3.org/2001/XMLSchema" xmlns:xs="http://www.w3.org/2001/XMLSchema" xmlns:p="http://schemas.microsoft.com/office/2006/metadata/properties" xmlns:ns2="126e8a1c-9ea9-435a-ac89-d06c80d62e30" targetNamespace="http://schemas.microsoft.com/office/2006/metadata/properties" ma:root="true" ma:fieldsID="70a237c842677bd850644f8595079f5e" ns2:_="">
     <xsd:import namespace="126e8a1c-9ea9-435a-ac89-d06c80d62e30"/>
@@ -8829,13 +8998,11 @@
 </ct:contentTypeSchema>
 </file>
 
-<file path=customXml/item2.xml><?xml version="1.0" encoding="utf-8"?>
-<p:properties xmlns:p="http://schemas.microsoft.com/office/2006/metadata/properties" xmlns:xsi="http://www.w3.org/2001/XMLSchema-instance" xmlns:pc="http://schemas.microsoft.com/office/infopath/2007/PartnerControls">
-  <documentManagement/>
-</p:properties>
+<file path=customXml/item3.xml><?xml version="1.0" encoding="utf-8"?>
+<b:Sources xmlns:b="http://schemas.openxmlformats.org/officeDocument/2006/bibliography" xmlns="http://schemas.openxmlformats.org/officeDocument/2006/bibliography" SelectedStyle="\APASixthEditionOfficeOnline.xsl" StyleName="APA" Version="6"/>
 </file>
 
-<file path=customXml/item3.xml><?xml version="1.0" encoding="utf-8"?>
+<file path=customXml/item4.xml><?xml version="1.0" encoding="utf-8"?>
 <?mso-contentType ?>
 <FormTemplates xmlns="http://schemas.microsoft.com/sharepoint/v3/contenttype/forms">
   <Display>DocumentLibraryForm</Display>
@@ -8844,11 +9011,16 @@
 </FormTemplates>
 </file>
 
-<file path=customXml/item4.xml><?xml version="1.0" encoding="utf-8"?>
-<b:Sources xmlns:b="http://schemas.openxmlformats.org/officeDocument/2006/bibliography" xmlns="http://schemas.openxmlformats.org/officeDocument/2006/bibliography" SelectedStyle="\APASixthEditionOfficeOnline.xsl" StyleName="APA" Version="6"/>
+<file path=customXml/itemProps1.xml><?xml version="1.0" encoding="utf-8"?>
+<ds:datastoreItem xmlns:ds="http://schemas.openxmlformats.org/officeDocument/2006/customXml" ds:itemID="{5F1783E3-BA1C-4CA3-8E32-C9B378BBED03}">
+  <ds:schemaRefs>
+    <ds:schemaRef ds:uri="http://schemas.microsoft.com/office/2006/metadata/properties"/>
+    <ds:schemaRef ds:uri="http://schemas.microsoft.com/office/infopath/2007/PartnerControls"/>
+  </ds:schemaRefs>
+</ds:datastoreItem>
 </file>
 
-<file path=customXml/itemProps1.xml><?xml version="1.0" encoding="utf-8"?>
+<file path=customXml/itemProps2.xml><?xml version="1.0" encoding="utf-8"?>
 <ds:datastoreItem xmlns:ds="http://schemas.openxmlformats.org/officeDocument/2006/customXml" ds:itemID="{DF0582E6-0C2C-40A6-8E3D-E410E41021C1}">
   <ds:schemaRefs>
     <ds:schemaRef ds:uri="http://schemas.microsoft.com/office/2006/metadata/contentType"/>
@@ -8866,34 +9038,18 @@
 </ds:datastoreItem>
 </file>
 
-<file path=customXml/itemProps2.xml><?xml version="1.0" encoding="utf-8"?>
-<ds:datastoreItem xmlns:ds="http://schemas.openxmlformats.org/officeDocument/2006/customXml" ds:itemID="{5F1783E3-BA1C-4CA3-8E32-C9B378BBED03}">
+<file path=customXml/itemProps3.xml><?xml version="1.0" encoding="utf-8"?>
+<ds:datastoreItem xmlns:ds="http://schemas.openxmlformats.org/officeDocument/2006/customXml" ds:itemID="{FBD61725-A60E-40F3-AB5D-0E7F797DD77D}">
   <ds:schemaRefs>
-    <ds:schemaRef ds:uri="http://schemas.openxmlformats.org/package/2006/metadata/core-properties"/>
-    <ds:schemaRef ds:uri="http://schemas.microsoft.com/office/infopath/2007/PartnerControls"/>
-    <ds:schemaRef ds:uri="http://purl.org/dc/elements/1.1/"/>
-    <ds:schemaRef ds:uri="http://schemas.microsoft.com/office/2006/documentManagement/types"/>
-    <ds:schemaRef ds:uri="http://schemas.microsoft.com/office/2006/metadata/properties"/>
-    <ds:schemaRef ds:uri="126e8a1c-9ea9-435a-ac89-d06c80d62e30"/>
-    <ds:schemaRef ds:uri="http://purl.org/dc/terms/"/>
-    <ds:schemaRef ds:uri="http://purl.org/dc/dcmitype/"/>
-    <ds:schemaRef ds:uri="http://www.w3.org/XML/1998/namespace"/>
+    <ds:schemaRef ds:uri="http://schemas.openxmlformats.org/officeDocument/2006/bibliography"/>
   </ds:schemaRefs>
 </ds:datastoreItem>
 </file>
 
-<file path=customXml/itemProps3.xml><?xml version="1.0" encoding="utf-8"?>
+<file path=customXml/itemProps4.xml><?xml version="1.0" encoding="utf-8"?>
 <ds:datastoreItem xmlns:ds="http://schemas.openxmlformats.org/officeDocument/2006/customXml" ds:itemID="{DABAA964-10BA-4DBC-ABF2-CDEAC0FAF7AA}">
   <ds:schemaRefs>
     <ds:schemaRef ds:uri="http://schemas.microsoft.com/sharepoint/v3/contenttype/forms"/>
   </ds:schemaRefs>
 </ds:datastoreItem>
-</file>
-
-<file path=customXml/itemProps4.xml><?xml version="1.0" encoding="utf-8"?>
-<ds:datastoreItem xmlns:ds="http://schemas.openxmlformats.org/officeDocument/2006/customXml" ds:itemID="{FBD61725-A60E-40F3-AB5D-0E7F797DD77D}">
-  <ds:schemaRefs>
-    <ds:schemaRef ds:uri="http://schemas.openxmlformats.org/officeDocument/2006/bibliography"/>
-  </ds:schemaRefs>
-</ds:datastoreItem>
 </file>
</xml_diff>